<commit_message>
add Docker Part 1
</commit_message>
<xml_diff>
--- a/W5/22716341_CaoThanhDong_W5.docx
+++ b/W5/22716341_CaoThanhDong_W5.docx
@@ -1370,9 +1370,3718 @@
           <w:rFonts w:ascii="Times New Roman" w:hAnsi="Times New Roman" w:cs="Times New Roman"/>
         </w:rPr>
       </w:pPr>
+    </w:p>
+    <w:p>
+      <w:pPr>
+        <w:rPr>
+          <w:rFonts w:ascii="Times New Roman" w:hAnsi="Times New Roman" w:cs="Times New Roman"/>
+        </w:rPr>
+      </w:pPr>
       <w:r>
         <w:rPr>
           <w:rFonts w:ascii="Times New Roman" w:hAnsi="Times New Roman" w:cs="Times New Roman"/>
+        </w:rPr>
+        <w:br w:type="page"/>
+      </w:r>
+    </w:p>
+    <w:p>
+      <w:pPr>
+        <w:jc w:val="center"/>
+        <w:rPr>
+          <w:rFonts w:ascii="Times New Roman" w:hAnsi="Times New Roman" w:cs="Times New Roman"/>
+          <w:b/>
+          <w:bCs/>
+        </w:rPr>
+      </w:pPr>
+      <w:r>
+        <w:rPr>
+          <w:rFonts w:ascii="Times New Roman" w:hAnsi="Times New Roman" w:cs="Times New Roman"/>
+          <w:b/>
+          <w:bCs/>
+        </w:rPr>
+        <w:lastRenderedPageBreak/>
+        <w:t>DOCKER – PART 1</w:t>
+      </w:r>
+    </w:p>
+    <w:p>
+      <w:pPr>
+        <w:rPr>
+          <w:rFonts w:ascii="Times New Roman" w:hAnsi="Times New Roman" w:cs="Times New Roman"/>
+          <w:b/>
+          <w:bCs/>
+        </w:rPr>
+      </w:pPr>
+      <w:r>
+        <w:rPr>
+          <w:rFonts w:ascii="Times New Roman" w:hAnsi="Times New Roman" w:cs="Times New Roman"/>
+          <w:b/>
+          <w:bCs/>
+        </w:rPr>
+        <w:t>Phần 1: Các thao tác cơ bản với Docker</w:t>
+      </w:r>
+    </w:p>
+    <w:tbl>
+      <w:tblPr>
+        <w:tblW w:w="9892" w:type="dxa"/>
+        <w:tblCellMar>
+          <w:left w:w="0" w:type="dxa"/>
+          <w:right w:w="0" w:type="dxa"/>
+        </w:tblCellMar>
+        <w:tblLook w:val="04A0" w:firstRow="1" w:lastRow="0" w:firstColumn="1" w:lastColumn="0" w:noHBand="0" w:noVBand="1"/>
+      </w:tblPr>
+      <w:tblGrid>
+        <w:gridCol w:w="442"/>
+        <w:gridCol w:w="9450"/>
+      </w:tblGrid>
+      <w:tr>
+        <w:trPr>
+          <w:trHeight w:val="315"/>
+        </w:trPr>
+        <w:tc>
+          <w:tcPr>
+            <w:tcW w:w="532" w:type="dxa"/>
+            <w:tcBorders>
+              <w:top w:val="single" w:sz="6" w:space="0" w:color="CCCCCC"/>
+              <w:left w:val="single" w:sz="6" w:space="0" w:color="CCCCCC"/>
+              <w:bottom w:val="single" w:sz="6" w:space="0" w:color="CCCCCC"/>
+              <w:right w:val="single" w:sz="6" w:space="0" w:color="CCCCCC"/>
+            </w:tcBorders>
+            <w:tcMar>
+              <w:top w:w="0" w:type="dxa"/>
+              <w:left w:w="45" w:type="dxa"/>
+              <w:bottom w:w="0" w:type="dxa"/>
+              <w:right w:w="45" w:type="dxa"/>
+            </w:tcMar>
+            <w:vAlign w:val="bottom"/>
+            <w:hideMark/>
+          </w:tcPr>
+          <w:p>
+            <w:pPr>
+              <w:rPr>
+                <w:rFonts w:ascii="Times New Roman" w:hAnsi="Times New Roman" w:cs="Times New Roman"/>
+              </w:rPr>
+            </w:pPr>
+            <w:r>
+              <w:rPr>
+                <w:rFonts w:ascii="Times New Roman" w:hAnsi="Times New Roman" w:cs="Times New Roman"/>
+              </w:rPr>
+              <w:t>1</w:t>
+            </w:r>
+          </w:p>
+        </w:tc>
+        <w:tc>
+          <w:tcPr>
+            <w:tcW w:w="9360" w:type="dxa"/>
+            <w:tcBorders>
+              <w:top w:val="single" w:sz="6" w:space="0" w:color="CCCCCC"/>
+              <w:left w:val="single" w:sz="6" w:space="0" w:color="CCCCCC"/>
+              <w:bottom w:val="single" w:sz="6" w:space="0" w:color="CCCCCC"/>
+              <w:right w:val="single" w:sz="6" w:space="0" w:color="CCCCCC"/>
+            </w:tcBorders>
+            <w:tcMar>
+              <w:top w:w="0" w:type="dxa"/>
+              <w:left w:w="45" w:type="dxa"/>
+              <w:bottom w:w="0" w:type="dxa"/>
+              <w:right w:w="45" w:type="dxa"/>
+            </w:tcMar>
+            <w:vAlign w:val="bottom"/>
+            <w:hideMark/>
+          </w:tcPr>
+          <w:p>
+            <w:pPr>
+              <w:rPr>
+                <w:rFonts w:ascii="Times New Roman" w:hAnsi="Times New Roman" w:cs="Times New Roman"/>
+              </w:rPr>
+            </w:pPr>
+            <w:r>
+              <w:rPr>
+                <w:rFonts w:ascii="Times New Roman" w:hAnsi="Times New Roman" w:cs="Times New Roman"/>
+              </w:rPr>
+              <w:t xml:space="preserve">docker </w:t>
+            </w:r>
+            <w:r>
+              <w:rPr>
+                <w:rFonts w:ascii="Times New Roman" w:hAnsi="Times New Roman" w:cs="Times New Roman"/>
+              </w:rPr>
+              <w:t>–</w:t>
+            </w:r>
+            <w:r>
+              <w:rPr>
+                <w:rFonts w:ascii="Times New Roman" w:hAnsi="Times New Roman" w:cs="Times New Roman"/>
+              </w:rPr>
+              <w:t>version</w:t>
+            </w:r>
+          </w:p>
+          <w:p>
+            <w:pPr>
+              <w:rPr>
+                <w:rFonts w:ascii="Times New Roman" w:hAnsi="Times New Roman" w:cs="Times New Roman"/>
+              </w:rPr>
+            </w:pPr>
+            <w:r>
+              <w:rPr>
+                <w:rFonts w:ascii="Times New Roman" w:hAnsi="Times New Roman" w:cs="Times New Roman"/>
+              </w:rPr>
+              <w:drawing>
+                <wp:inline distT="0" distB="0" distL="0" distR="0" wp14:anchorId="3A486AD5" wp14:editId="07375323">
+                  <wp:extent cx="4058216" cy="485843"/>
+                  <wp:effectExtent l="0" t="0" r="0" b="9525"/>
+                  <wp:docPr id="2029272404" name="Picture 1"/>
+                  <wp:cNvGraphicFramePr>
+                    <a:graphicFrameLocks xmlns:a="http://schemas.openxmlformats.org/drawingml/2006/main" noChangeAspect="1"/>
+                  </wp:cNvGraphicFramePr>
+                  <a:graphic xmlns:a="http://schemas.openxmlformats.org/drawingml/2006/main">
+                    <a:graphicData uri="http://schemas.openxmlformats.org/drawingml/2006/picture">
+                      <pic:pic xmlns:pic="http://schemas.openxmlformats.org/drawingml/2006/picture">
+                        <pic:nvPicPr>
+                          <pic:cNvPr id="2029272404" name=""/>
+                          <pic:cNvPicPr/>
+                        </pic:nvPicPr>
+                        <pic:blipFill>
+                          <a:blip r:embed="rId7"/>
+                          <a:stretch>
+                            <a:fillRect/>
+                          </a:stretch>
+                        </pic:blipFill>
+                        <pic:spPr>
+                          <a:xfrm>
+                            <a:off x="0" y="0"/>
+                            <a:ext cx="4058216" cy="485843"/>
+                          </a:xfrm>
+                          <a:prstGeom prst="rect">
+                            <a:avLst/>
+                          </a:prstGeom>
+                        </pic:spPr>
+                      </pic:pic>
+                    </a:graphicData>
+                  </a:graphic>
+                </wp:inline>
+              </w:drawing>
+            </w:r>
+          </w:p>
+        </w:tc>
+      </w:tr>
+      <w:tr>
+        <w:trPr>
+          <w:trHeight w:val="315"/>
+        </w:trPr>
+        <w:tc>
+          <w:tcPr>
+            <w:tcW w:w="532" w:type="dxa"/>
+            <w:tcBorders>
+              <w:top w:val="single" w:sz="6" w:space="0" w:color="CCCCCC"/>
+              <w:left w:val="single" w:sz="6" w:space="0" w:color="CCCCCC"/>
+              <w:bottom w:val="single" w:sz="6" w:space="0" w:color="CCCCCC"/>
+              <w:right w:val="single" w:sz="6" w:space="0" w:color="CCCCCC"/>
+            </w:tcBorders>
+            <w:tcMar>
+              <w:top w:w="0" w:type="dxa"/>
+              <w:left w:w="45" w:type="dxa"/>
+              <w:bottom w:w="0" w:type="dxa"/>
+              <w:right w:w="45" w:type="dxa"/>
+            </w:tcMar>
+            <w:vAlign w:val="bottom"/>
+            <w:hideMark/>
+          </w:tcPr>
+          <w:p>
+            <w:pPr>
+              <w:rPr>
+                <w:rFonts w:ascii="Times New Roman" w:hAnsi="Times New Roman" w:cs="Times New Roman"/>
+              </w:rPr>
+            </w:pPr>
+            <w:r>
+              <w:rPr>
+                <w:rFonts w:ascii="Times New Roman" w:hAnsi="Times New Roman" w:cs="Times New Roman"/>
+              </w:rPr>
+              <w:t>2</w:t>
+            </w:r>
+          </w:p>
+        </w:tc>
+        <w:tc>
+          <w:tcPr>
+            <w:tcW w:w="9360" w:type="dxa"/>
+            <w:tcBorders>
+              <w:top w:val="single" w:sz="6" w:space="0" w:color="CCCCCC"/>
+              <w:left w:val="single" w:sz="6" w:space="0" w:color="CCCCCC"/>
+              <w:bottom w:val="single" w:sz="6" w:space="0" w:color="CCCCCC"/>
+              <w:right w:val="single" w:sz="6" w:space="0" w:color="CCCCCC"/>
+            </w:tcBorders>
+            <w:tcMar>
+              <w:top w:w="0" w:type="dxa"/>
+              <w:left w:w="45" w:type="dxa"/>
+              <w:bottom w:w="0" w:type="dxa"/>
+              <w:right w:w="45" w:type="dxa"/>
+            </w:tcMar>
+            <w:vAlign w:val="bottom"/>
+            <w:hideMark/>
+          </w:tcPr>
+          <w:p>
+            <w:pPr>
+              <w:rPr>
+                <w:rFonts w:ascii="Times New Roman" w:hAnsi="Times New Roman" w:cs="Times New Roman"/>
+              </w:rPr>
+            </w:pPr>
+            <w:r>
+              <w:rPr>
+                <w:rFonts w:ascii="Times New Roman" w:hAnsi="Times New Roman" w:cs="Times New Roman"/>
+              </w:rPr>
+              <w:t>docker run hello-world</w:t>
+            </w:r>
+          </w:p>
+          <w:p>
+            <w:pPr>
+              <w:rPr>
+                <w:rFonts w:ascii="Times New Roman" w:hAnsi="Times New Roman" w:cs="Times New Roman"/>
+              </w:rPr>
+            </w:pPr>
+            <w:r>
+              <w:rPr>
+                <w:rFonts w:ascii="Times New Roman" w:hAnsi="Times New Roman" w:cs="Times New Roman"/>
+              </w:rPr>
+              <w:drawing>
+                <wp:inline distT="0" distB="0" distL="0" distR="0" wp14:anchorId="32DB07E4" wp14:editId="17CA8A93">
+                  <wp:extent cx="5943600" cy="1643380"/>
+                  <wp:effectExtent l="0" t="0" r="0" b="0"/>
+                  <wp:docPr id="653220420" name="Picture 1"/>
+                  <wp:cNvGraphicFramePr>
+                    <a:graphicFrameLocks xmlns:a="http://schemas.openxmlformats.org/drawingml/2006/main" noChangeAspect="1"/>
+                  </wp:cNvGraphicFramePr>
+                  <a:graphic xmlns:a="http://schemas.openxmlformats.org/drawingml/2006/main">
+                    <a:graphicData uri="http://schemas.openxmlformats.org/drawingml/2006/picture">
+                      <pic:pic xmlns:pic="http://schemas.openxmlformats.org/drawingml/2006/picture">
+                        <pic:nvPicPr>
+                          <pic:cNvPr id="653220420" name=""/>
+                          <pic:cNvPicPr/>
+                        </pic:nvPicPr>
+                        <pic:blipFill>
+                          <a:blip r:embed="rId8"/>
+                          <a:stretch>
+                            <a:fillRect/>
+                          </a:stretch>
+                        </pic:blipFill>
+                        <pic:spPr>
+                          <a:xfrm>
+                            <a:off x="0" y="0"/>
+                            <a:ext cx="5943600" cy="1643380"/>
+                          </a:xfrm>
+                          <a:prstGeom prst="rect">
+                            <a:avLst/>
+                          </a:prstGeom>
+                        </pic:spPr>
+                      </pic:pic>
+                    </a:graphicData>
+                  </a:graphic>
+                </wp:inline>
+              </w:drawing>
+            </w:r>
+          </w:p>
+        </w:tc>
+      </w:tr>
+      <w:tr>
+        <w:trPr>
+          <w:trHeight w:val="315"/>
+        </w:trPr>
+        <w:tc>
+          <w:tcPr>
+            <w:tcW w:w="532" w:type="dxa"/>
+            <w:tcBorders>
+              <w:top w:val="single" w:sz="6" w:space="0" w:color="CCCCCC"/>
+              <w:left w:val="single" w:sz="6" w:space="0" w:color="CCCCCC"/>
+              <w:bottom w:val="single" w:sz="6" w:space="0" w:color="CCCCCC"/>
+              <w:right w:val="single" w:sz="6" w:space="0" w:color="CCCCCC"/>
+            </w:tcBorders>
+            <w:tcMar>
+              <w:top w:w="0" w:type="dxa"/>
+              <w:left w:w="45" w:type="dxa"/>
+              <w:bottom w:w="0" w:type="dxa"/>
+              <w:right w:w="45" w:type="dxa"/>
+            </w:tcMar>
+            <w:vAlign w:val="bottom"/>
+            <w:hideMark/>
+          </w:tcPr>
+          <w:p>
+            <w:pPr>
+              <w:rPr>
+                <w:rFonts w:ascii="Times New Roman" w:hAnsi="Times New Roman" w:cs="Times New Roman"/>
+              </w:rPr>
+            </w:pPr>
+            <w:r>
+              <w:rPr>
+                <w:rFonts w:ascii="Times New Roman" w:hAnsi="Times New Roman" w:cs="Times New Roman"/>
+              </w:rPr>
+              <w:t>3</w:t>
+            </w:r>
+          </w:p>
+        </w:tc>
+        <w:tc>
+          <w:tcPr>
+            <w:tcW w:w="9360" w:type="dxa"/>
+            <w:tcBorders>
+              <w:top w:val="single" w:sz="6" w:space="0" w:color="CCCCCC"/>
+              <w:left w:val="single" w:sz="6" w:space="0" w:color="CCCCCC"/>
+              <w:bottom w:val="single" w:sz="6" w:space="0" w:color="CCCCCC"/>
+              <w:right w:val="single" w:sz="6" w:space="0" w:color="CCCCCC"/>
+            </w:tcBorders>
+            <w:tcMar>
+              <w:top w:w="0" w:type="dxa"/>
+              <w:left w:w="45" w:type="dxa"/>
+              <w:bottom w:w="0" w:type="dxa"/>
+              <w:right w:w="45" w:type="dxa"/>
+            </w:tcMar>
+            <w:vAlign w:val="bottom"/>
+            <w:hideMark/>
+          </w:tcPr>
+          <w:p>
+            <w:pPr>
+              <w:rPr>
+                <w:rFonts w:ascii="Times New Roman" w:hAnsi="Times New Roman" w:cs="Times New Roman"/>
+              </w:rPr>
+            </w:pPr>
+            <w:r>
+              <w:rPr>
+                <w:rFonts w:ascii="Times New Roman" w:hAnsi="Times New Roman" w:cs="Times New Roman"/>
+              </w:rPr>
+              <w:t>docker pull nginx</w:t>
+            </w:r>
+          </w:p>
+          <w:p>
+            <w:pPr>
+              <w:rPr>
+                <w:rFonts w:ascii="Times New Roman" w:hAnsi="Times New Roman" w:cs="Times New Roman"/>
+              </w:rPr>
+            </w:pPr>
+            <w:r>
+              <w:rPr>
+                <w:rFonts w:ascii="Times New Roman" w:hAnsi="Times New Roman" w:cs="Times New Roman"/>
+              </w:rPr>
+              <w:drawing>
+                <wp:inline distT="0" distB="0" distL="0" distR="0" wp14:anchorId="321FB5CF" wp14:editId="058E854B">
+                  <wp:extent cx="5943600" cy="2324100"/>
+                  <wp:effectExtent l="0" t="0" r="0" b="0"/>
+                  <wp:docPr id="1531609762" name="Picture 1"/>
+                  <wp:cNvGraphicFramePr>
+                    <a:graphicFrameLocks xmlns:a="http://schemas.openxmlformats.org/drawingml/2006/main" noChangeAspect="1"/>
+                  </wp:cNvGraphicFramePr>
+                  <a:graphic xmlns:a="http://schemas.openxmlformats.org/drawingml/2006/main">
+                    <a:graphicData uri="http://schemas.openxmlformats.org/drawingml/2006/picture">
+                      <pic:pic xmlns:pic="http://schemas.openxmlformats.org/drawingml/2006/picture">
+                        <pic:nvPicPr>
+                          <pic:cNvPr id="1531609762" name=""/>
+                          <pic:cNvPicPr/>
+                        </pic:nvPicPr>
+                        <pic:blipFill>
+                          <a:blip r:embed="rId9"/>
+                          <a:stretch>
+                            <a:fillRect/>
+                          </a:stretch>
+                        </pic:blipFill>
+                        <pic:spPr>
+                          <a:xfrm>
+                            <a:off x="0" y="0"/>
+                            <a:ext cx="5943600" cy="2324100"/>
+                          </a:xfrm>
+                          <a:prstGeom prst="rect">
+                            <a:avLst/>
+                          </a:prstGeom>
+                        </pic:spPr>
+                      </pic:pic>
+                    </a:graphicData>
+                  </a:graphic>
+                </wp:inline>
+              </w:drawing>
+            </w:r>
+          </w:p>
+        </w:tc>
+      </w:tr>
+      <w:tr>
+        <w:trPr>
+          <w:trHeight w:val="315"/>
+        </w:trPr>
+        <w:tc>
+          <w:tcPr>
+            <w:tcW w:w="532" w:type="dxa"/>
+            <w:tcBorders>
+              <w:top w:val="single" w:sz="6" w:space="0" w:color="CCCCCC"/>
+              <w:left w:val="single" w:sz="6" w:space="0" w:color="CCCCCC"/>
+              <w:bottom w:val="single" w:sz="6" w:space="0" w:color="CCCCCC"/>
+              <w:right w:val="single" w:sz="6" w:space="0" w:color="CCCCCC"/>
+            </w:tcBorders>
+            <w:tcMar>
+              <w:top w:w="0" w:type="dxa"/>
+              <w:left w:w="45" w:type="dxa"/>
+              <w:bottom w:w="0" w:type="dxa"/>
+              <w:right w:w="45" w:type="dxa"/>
+            </w:tcMar>
+            <w:vAlign w:val="bottom"/>
+            <w:hideMark/>
+          </w:tcPr>
+          <w:p>
+            <w:pPr>
+              <w:rPr>
+                <w:rFonts w:ascii="Times New Roman" w:hAnsi="Times New Roman" w:cs="Times New Roman"/>
+              </w:rPr>
+            </w:pPr>
+            <w:r>
+              <w:rPr>
+                <w:rFonts w:ascii="Times New Roman" w:hAnsi="Times New Roman" w:cs="Times New Roman"/>
+              </w:rPr>
+              <w:t>4</w:t>
+            </w:r>
+          </w:p>
+        </w:tc>
+        <w:tc>
+          <w:tcPr>
+            <w:tcW w:w="9360" w:type="dxa"/>
+            <w:tcBorders>
+              <w:top w:val="single" w:sz="6" w:space="0" w:color="CCCCCC"/>
+              <w:left w:val="single" w:sz="6" w:space="0" w:color="CCCCCC"/>
+              <w:bottom w:val="single" w:sz="6" w:space="0" w:color="CCCCCC"/>
+              <w:right w:val="single" w:sz="6" w:space="0" w:color="CCCCCC"/>
+            </w:tcBorders>
+            <w:tcMar>
+              <w:top w:w="0" w:type="dxa"/>
+              <w:left w:w="45" w:type="dxa"/>
+              <w:bottom w:w="0" w:type="dxa"/>
+              <w:right w:w="45" w:type="dxa"/>
+            </w:tcMar>
+            <w:vAlign w:val="bottom"/>
+            <w:hideMark/>
+          </w:tcPr>
+          <w:p>
+            <w:pPr>
+              <w:rPr>
+                <w:rFonts w:ascii="Times New Roman" w:hAnsi="Times New Roman" w:cs="Times New Roman"/>
+              </w:rPr>
+            </w:pPr>
+            <w:r>
+              <w:rPr>
+                <w:rFonts w:ascii="Times New Roman" w:hAnsi="Times New Roman" w:cs="Times New Roman"/>
+              </w:rPr>
+              <w:t>docker images</w:t>
+            </w:r>
+          </w:p>
+          <w:p>
+            <w:pPr>
+              <w:rPr>
+                <w:rFonts w:ascii="Times New Roman" w:hAnsi="Times New Roman" w:cs="Times New Roman"/>
+              </w:rPr>
+            </w:pPr>
+            <w:r>
+              <w:rPr>
+                <w:rFonts w:ascii="Times New Roman" w:hAnsi="Times New Roman" w:cs="Times New Roman"/>
+              </w:rPr>
+              <w:lastRenderedPageBreak/>
+              <w:drawing>
+                <wp:inline distT="0" distB="0" distL="0" distR="0" wp14:anchorId="3AF06C88" wp14:editId="34807692">
+                  <wp:extent cx="5943600" cy="1625600"/>
+                  <wp:effectExtent l="0" t="0" r="0" b="0"/>
+                  <wp:docPr id="882326409" name="Picture 1"/>
+                  <wp:cNvGraphicFramePr>
+                    <a:graphicFrameLocks xmlns:a="http://schemas.openxmlformats.org/drawingml/2006/main" noChangeAspect="1"/>
+                  </wp:cNvGraphicFramePr>
+                  <a:graphic xmlns:a="http://schemas.openxmlformats.org/drawingml/2006/main">
+                    <a:graphicData uri="http://schemas.openxmlformats.org/drawingml/2006/picture">
+                      <pic:pic xmlns:pic="http://schemas.openxmlformats.org/drawingml/2006/picture">
+                        <pic:nvPicPr>
+                          <pic:cNvPr id="882326409" name=""/>
+                          <pic:cNvPicPr/>
+                        </pic:nvPicPr>
+                        <pic:blipFill>
+                          <a:blip r:embed="rId10"/>
+                          <a:stretch>
+                            <a:fillRect/>
+                          </a:stretch>
+                        </pic:blipFill>
+                        <pic:spPr>
+                          <a:xfrm>
+                            <a:off x="0" y="0"/>
+                            <a:ext cx="5943600" cy="1625600"/>
+                          </a:xfrm>
+                          <a:prstGeom prst="rect">
+                            <a:avLst/>
+                          </a:prstGeom>
+                        </pic:spPr>
+                      </pic:pic>
+                    </a:graphicData>
+                  </a:graphic>
+                </wp:inline>
+              </w:drawing>
+            </w:r>
+          </w:p>
+        </w:tc>
+      </w:tr>
+      <w:tr>
+        <w:trPr>
+          <w:trHeight w:val="315"/>
+        </w:trPr>
+        <w:tc>
+          <w:tcPr>
+            <w:tcW w:w="532" w:type="dxa"/>
+            <w:tcBorders>
+              <w:top w:val="single" w:sz="6" w:space="0" w:color="CCCCCC"/>
+              <w:left w:val="single" w:sz="6" w:space="0" w:color="CCCCCC"/>
+              <w:bottom w:val="single" w:sz="6" w:space="0" w:color="CCCCCC"/>
+              <w:right w:val="single" w:sz="6" w:space="0" w:color="CCCCCC"/>
+            </w:tcBorders>
+            <w:tcMar>
+              <w:top w:w="0" w:type="dxa"/>
+              <w:left w:w="45" w:type="dxa"/>
+              <w:bottom w:w="0" w:type="dxa"/>
+              <w:right w:w="45" w:type="dxa"/>
+            </w:tcMar>
+            <w:vAlign w:val="bottom"/>
+            <w:hideMark/>
+          </w:tcPr>
+          <w:p>
+            <w:pPr>
+              <w:rPr>
+                <w:rFonts w:ascii="Times New Roman" w:hAnsi="Times New Roman" w:cs="Times New Roman"/>
+              </w:rPr>
+            </w:pPr>
+            <w:r>
+              <w:rPr>
+                <w:rFonts w:ascii="Times New Roman" w:hAnsi="Times New Roman" w:cs="Times New Roman"/>
+              </w:rPr>
+              <w:lastRenderedPageBreak/>
+              <w:t>5</w:t>
+            </w:r>
+          </w:p>
+        </w:tc>
+        <w:tc>
+          <w:tcPr>
+            <w:tcW w:w="9360" w:type="dxa"/>
+            <w:tcBorders>
+              <w:top w:val="single" w:sz="6" w:space="0" w:color="CCCCCC"/>
+              <w:left w:val="single" w:sz="6" w:space="0" w:color="CCCCCC"/>
+              <w:bottom w:val="single" w:sz="6" w:space="0" w:color="CCCCCC"/>
+              <w:right w:val="single" w:sz="6" w:space="0" w:color="CCCCCC"/>
+            </w:tcBorders>
+            <w:tcMar>
+              <w:top w:w="0" w:type="dxa"/>
+              <w:left w:w="45" w:type="dxa"/>
+              <w:bottom w:w="0" w:type="dxa"/>
+              <w:right w:w="45" w:type="dxa"/>
+            </w:tcMar>
+            <w:vAlign w:val="bottom"/>
+            <w:hideMark/>
+          </w:tcPr>
+          <w:p>
+            <w:pPr>
+              <w:rPr>
+                <w:rFonts w:ascii="Times New Roman" w:hAnsi="Times New Roman" w:cs="Times New Roman"/>
+              </w:rPr>
+            </w:pPr>
+            <w:r>
+              <w:rPr>
+                <w:rFonts w:ascii="Times New Roman" w:hAnsi="Times New Roman" w:cs="Times New Roman"/>
+              </w:rPr>
+              <w:t>docker run -d nginx</w:t>
+            </w:r>
+          </w:p>
+          <w:p>
+            <w:pPr>
+              <w:rPr>
+                <w:rFonts w:ascii="Times New Roman" w:hAnsi="Times New Roman" w:cs="Times New Roman"/>
+              </w:rPr>
+            </w:pPr>
+            <w:r>
+              <w:rPr>
+                <w:rFonts w:ascii="Times New Roman" w:hAnsi="Times New Roman" w:cs="Times New Roman"/>
+              </w:rPr>
+              <w:drawing>
+                <wp:inline distT="0" distB="0" distL="0" distR="0" wp14:anchorId="3F8AF9F3" wp14:editId="51A3A483">
+                  <wp:extent cx="5839640" cy="447737"/>
+                  <wp:effectExtent l="0" t="0" r="8890" b="9525"/>
+                  <wp:docPr id="889597439" name="Picture 1"/>
+                  <wp:cNvGraphicFramePr>
+                    <a:graphicFrameLocks xmlns:a="http://schemas.openxmlformats.org/drawingml/2006/main" noChangeAspect="1"/>
+                  </wp:cNvGraphicFramePr>
+                  <a:graphic xmlns:a="http://schemas.openxmlformats.org/drawingml/2006/main">
+                    <a:graphicData uri="http://schemas.openxmlformats.org/drawingml/2006/picture">
+                      <pic:pic xmlns:pic="http://schemas.openxmlformats.org/drawingml/2006/picture">
+                        <pic:nvPicPr>
+                          <pic:cNvPr id="889597439" name=""/>
+                          <pic:cNvPicPr/>
+                        </pic:nvPicPr>
+                        <pic:blipFill>
+                          <a:blip r:embed="rId11"/>
+                          <a:stretch>
+                            <a:fillRect/>
+                          </a:stretch>
+                        </pic:blipFill>
+                        <pic:spPr>
+                          <a:xfrm>
+                            <a:off x="0" y="0"/>
+                            <a:ext cx="5839640" cy="447737"/>
+                          </a:xfrm>
+                          <a:prstGeom prst="rect">
+                            <a:avLst/>
+                          </a:prstGeom>
+                        </pic:spPr>
+                      </pic:pic>
+                    </a:graphicData>
+                  </a:graphic>
+                </wp:inline>
+              </w:drawing>
+            </w:r>
+          </w:p>
+        </w:tc>
+      </w:tr>
+      <w:tr>
+        <w:trPr>
+          <w:trHeight w:val="315"/>
+        </w:trPr>
+        <w:tc>
+          <w:tcPr>
+            <w:tcW w:w="532" w:type="dxa"/>
+            <w:tcBorders>
+              <w:top w:val="single" w:sz="6" w:space="0" w:color="CCCCCC"/>
+              <w:left w:val="single" w:sz="6" w:space="0" w:color="CCCCCC"/>
+              <w:bottom w:val="single" w:sz="6" w:space="0" w:color="CCCCCC"/>
+              <w:right w:val="single" w:sz="6" w:space="0" w:color="CCCCCC"/>
+            </w:tcBorders>
+            <w:tcMar>
+              <w:top w:w="0" w:type="dxa"/>
+              <w:left w:w="45" w:type="dxa"/>
+              <w:bottom w:w="0" w:type="dxa"/>
+              <w:right w:w="45" w:type="dxa"/>
+            </w:tcMar>
+            <w:vAlign w:val="bottom"/>
+            <w:hideMark/>
+          </w:tcPr>
+          <w:p>
+            <w:pPr>
+              <w:rPr>
+                <w:rFonts w:ascii="Times New Roman" w:hAnsi="Times New Roman" w:cs="Times New Roman"/>
+              </w:rPr>
+            </w:pPr>
+            <w:r>
+              <w:rPr>
+                <w:rFonts w:ascii="Times New Roman" w:hAnsi="Times New Roman" w:cs="Times New Roman"/>
+              </w:rPr>
+              <w:t>6</w:t>
+            </w:r>
+          </w:p>
+        </w:tc>
+        <w:tc>
+          <w:tcPr>
+            <w:tcW w:w="9360" w:type="dxa"/>
+            <w:tcBorders>
+              <w:top w:val="single" w:sz="6" w:space="0" w:color="CCCCCC"/>
+              <w:left w:val="single" w:sz="6" w:space="0" w:color="CCCCCC"/>
+              <w:bottom w:val="single" w:sz="6" w:space="0" w:color="CCCCCC"/>
+              <w:right w:val="single" w:sz="6" w:space="0" w:color="CCCCCC"/>
+            </w:tcBorders>
+            <w:tcMar>
+              <w:top w:w="0" w:type="dxa"/>
+              <w:left w:w="45" w:type="dxa"/>
+              <w:bottom w:w="0" w:type="dxa"/>
+              <w:right w:w="45" w:type="dxa"/>
+            </w:tcMar>
+            <w:vAlign w:val="bottom"/>
+            <w:hideMark/>
+          </w:tcPr>
+          <w:p>
+            <w:pPr>
+              <w:rPr>
+                <w:rFonts w:ascii="Times New Roman" w:hAnsi="Times New Roman" w:cs="Times New Roman"/>
+              </w:rPr>
+            </w:pPr>
+            <w:r>
+              <w:rPr>
+                <w:rFonts w:ascii="Times New Roman" w:hAnsi="Times New Roman" w:cs="Times New Roman"/>
+              </w:rPr>
+              <w:t>docker ps</w:t>
+            </w:r>
+          </w:p>
+          <w:p>
+            <w:pPr>
+              <w:rPr>
+                <w:rFonts w:ascii="Times New Roman" w:hAnsi="Times New Roman" w:cs="Times New Roman"/>
+              </w:rPr>
+            </w:pPr>
+            <w:r>
+              <w:rPr>
+                <w:rFonts w:ascii="Times New Roman" w:hAnsi="Times New Roman" w:cs="Times New Roman"/>
+              </w:rPr>
+              <w:drawing>
+                <wp:inline distT="0" distB="0" distL="0" distR="0" wp14:anchorId="596AA999" wp14:editId="6BF940E9">
+                  <wp:extent cx="5943600" cy="416560"/>
+                  <wp:effectExtent l="0" t="0" r="0" b="2540"/>
+                  <wp:docPr id="514372825" name="Picture 1"/>
+                  <wp:cNvGraphicFramePr>
+                    <a:graphicFrameLocks xmlns:a="http://schemas.openxmlformats.org/drawingml/2006/main" noChangeAspect="1"/>
+                  </wp:cNvGraphicFramePr>
+                  <a:graphic xmlns:a="http://schemas.openxmlformats.org/drawingml/2006/main">
+                    <a:graphicData uri="http://schemas.openxmlformats.org/drawingml/2006/picture">
+                      <pic:pic xmlns:pic="http://schemas.openxmlformats.org/drawingml/2006/picture">
+                        <pic:nvPicPr>
+                          <pic:cNvPr id="514372825" name=""/>
+                          <pic:cNvPicPr/>
+                        </pic:nvPicPr>
+                        <pic:blipFill>
+                          <a:blip r:embed="rId12"/>
+                          <a:stretch>
+                            <a:fillRect/>
+                          </a:stretch>
+                        </pic:blipFill>
+                        <pic:spPr>
+                          <a:xfrm>
+                            <a:off x="0" y="0"/>
+                            <a:ext cx="5943600" cy="416560"/>
+                          </a:xfrm>
+                          <a:prstGeom prst="rect">
+                            <a:avLst/>
+                          </a:prstGeom>
+                        </pic:spPr>
+                      </pic:pic>
+                    </a:graphicData>
+                  </a:graphic>
+                </wp:inline>
+              </w:drawing>
+            </w:r>
+          </w:p>
+        </w:tc>
+      </w:tr>
+      <w:tr>
+        <w:trPr>
+          <w:trHeight w:val="315"/>
+        </w:trPr>
+        <w:tc>
+          <w:tcPr>
+            <w:tcW w:w="532" w:type="dxa"/>
+            <w:tcBorders>
+              <w:top w:val="single" w:sz="6" w:space="0" w:color="CCCCCC"/>
+              <w:left w:val="single" w:sz="6" w:space="0" w:color="CCCCCC"/>
+              <w:bottom w:val="single" w:sz="6" w:space="0" w:color="CCCCCC"/>
+              <w:right w:val="single" w:sz="6" w:space="0" w:color="CCCCCC"/>
+            </w:tcBorders>
+            <w:tcMar>
+              <w:top w:w="0" w:type="dxa"/>
+              <w:left w:w="45" w:type="dxa"/>
+              <w:bottom w:w="0" w:type="dxa"/>
+              <w:right w:w="45" w:type="dxa"/>
+            </w:tcMar>
+            <w:vAlign w:val="bottom"/>
+            <w:hideMark/>
+          </w:tcPr>
+          <w:p>
+            <w:pPr>
+              <w:rPr>
+                <w:rFonts w:ascii="Times New Roman" w:hAnsi="Times New Roman" w:cs="Times New Roman"/>
+              </w:rPr>
+            </w:pPr>
+            <w:r>
+              <w:rPr>
+                <w:rFonts w:ascii="Times New Roman" w:hAnsi="Times New Roman" w:cs="Times New Roman"/>
+              </w:rPr>
+              <w:t>7</w:t>
+            </w:r>
+          </w:p>
+        </w:tc>
+        <w:tc>
+          <w:tcPr>
+            <w:tcW w:w="9360" w:type="dxa"/>
+            <w:tcBorders>
+              <w:top w:val="single" w:sz="6" w:space="0" w:color="CCCCCC"/>
+              <w:left w:val="single" w:sz="6" w:space="0" w:color="CCCCCC"/>
+              <w:bottom w:val="single" w:sz="6" w:space="0" w:color="CCCCCC"/>
+              <w:right w:val="single" w:sz="6" w:space="0" w:color="CCCCCC"/>
+            </w:tcBorders>
+            <w:tcMar>
+              <w:top w:w="0" w:type="dxa"/>
+              <w:left w:w="45" w:type="dxa"/>
+              <w:bottom w:w="0" w:type="dxa"/>
+              <w:right w:w="45" w:type="dxa"/>
+            </w:tcMar>
+            <w:vAlign w:val="bottom"/>
+            <w:hideMark/>
+          </w:tcPr>
+          <w:p>
+            <w:pPr>
+              <w:rPr>
+                <w:rFonts w:ascii="Times New Roman" w:hAnsi="Times New Roman" w:cs="Times New Roman"/>
+              </w:rPr>
+            </w:pPr>
+            <w:r>
+              <w:rPr>
+                <w:rFonts w:ascii="Times New Roman" w:hAnsi="Times New Roman" w:cs="Times New Roman"/>
+              </w:rPr>
+              <w:t>docker ps -a</w:t>
+            </w:r>
+          </w:p>
+          <w:p>
+            <w:pPr>
+              <w:rPr>
+                <w:rFonts w:ascii="Times New Roman" w:hAnsi="Times New Roman" w:cs="Times New Roman"/>
+              </w:rPr>
+            </w:pPr>
+            <w:r>
+              <w:rPr>
+                <w:rFonts w:ascii="Times New Roman" w:hAnsi="Times New Roman" w:cs="Times New Roman"/>
+              </w:rPr>
+              <w:drawing>
+                <wp:inline distT="0" distB="0" distL="0" distR="0" wp14:anchorId="2F0E1E01" wp14:editId="4BA1D20C">
+                  <wp:extent cx="5943600" cy="2128520"/>
+                  <wp:effectExtent l="0" t="0" r="0" b="5080"/>
+                  <wp:docPr id="188680413" name="Picture 1"/>
+                  <wp:cNvGraphicFramePr>
+                    <a:graphicFrameLocks xmlns:a="http://schemas.openxmlformats.org/drawingml/2006/main" noChangeAspect="1"/>
+                  </wp:cNvGraphicFramePr>
+                  <a:graphic xmlns:a="http://schemas.openxmlformats.org/drawingml/2006/main">
+                    <a:graphicData uri="http://schemas.openxmlformats.org/drawingml/2006/picture">
+                      <pic:pic xmlns:pic="http://schemas.openxmlformats.org/drawingml/2006/picture">
+                        <pic:nvPicPr>
+                          <pic:cNvPr id="188680413" name=""/>
+                          <pic:cNvPicPr/>
+                        </pic:nvPicPr>
+                        <pic:blipFill>
+                          <a:blip r:embed="rId13"/>
+                          <a:stretch>
+                            <a:fillRect/>
+                          </a:stretch>
+                        </pic:blipFill>
+                        <pic:spPr>
+                          <a:xfrm>
+                            <a:off x="0" y="0"/>
+                            <a:ext cx="5943600" cy="2128520"/>
+                          </a:xfrm>
+                          <a:prstGeom prst="rect">
+                            <a:avLst/>
+                          </a:prstGeom>
+                        </pic:spPr>
+                      </pic:pic>
+                    </a:graphicData>
+                  </a:graphic>
+                </wp:inline>
+              </w:drawing>
+            </w:r>
+          </w:p>
+        </w:tc>
+      </w:tr>
+      <w:tr>
+        <w:trPr>
+          <w:trHeight w:val="315"/>
+        </w:trPr>
+        <w:tc>
+          <w:tcPr>
+            <w:tcW w:w="532" w:type="dxa"/>
+            <w:tcBorders>
+              <w:top w:val="single" w:sz="6" w:space="0" w:color="CCCCCC"/>
+              <w:left w:val="single" w:sz="6" w:space="0" w:color="CCCCCC"/>
+              <w:bottom w:val="single" w:sz="6" w:space="0" w:color="CCCCCC"/>
+              <w:right w:val="single" w:sz="6" w:space="0" w:color="CCCCCC"/>
+            </w:tcBorders>
+            <w:tcMar>
+              <w:top w:w="0" w:type="dxa"/>
+              <w:left w:w="45" w:type="dxa"/>
+              <w:bottom w:w="0" w:type="dxa"/>
+              <w:right w:w="45" w:type="dxa"/>
+            </w:tcMar>
+            <w:vAlign w:val="bottom"/>
+            <w:hideMark/>
+          </w:tcPr>
+          <w:p>
+            <w:pPr>
+              <w:rPr>
+                <w:rFonts w:ascii="Times New Roman" w:hAnsi="Times New Roman" w:cs="Times New Roman"/>
+              </w:rPr>
+            </w:pPr>
+            <w:r>
+              <w:rPr>
+                <w:rFonts w:ascii="Times New Roman" w:hAnsi="Times New Roman" w:cs="Times New Roman"/>
+              </w:rPr>
+              <w:t>8</w:t>
+            </w:r>
+          </w:p>
+        </w:tc>
+        <w:tc>
+          <w:tcPr>
+            <w:tcW w:w="9360" w:type="dxa"/>
+            <w:tcBorders>
+              <w:top w:val="single" w:sz="6" w:space="0" w:color="CCCCCC"/>
+              <w:left w:val="single" w:sz="6" w:space="0" w:color="CCCCCC"/>
+              <w:bottom w:val="single" w:sz="6" w:space="0" w:color="CCCCCC"/>
+              <w:right w:val="single" w:sz="6" w:space="0" w:color="CCCCCC"/>
+            </w:tcBorders>
+            <w:tcMar>
+              <w:top w:w="0" w:type="dxa"/>
+              <w:left w:w="45" w:type="dxa"/>
+              <w:bottom w:w="0" w:type="dxa"/>
+              <w:right w:w="45" w:type="dxa"/>
+            </w:tcMar>
+            <w:vAlign w:val="bottom"/>
+            <w:hideMark/>
+          </w:tcPr>
+          <w:p>
+            <w:pPr>
+              <w:rPr>
+                <w:rFonts w:ascii="Times New Roman" w:hAnsi="Times New Roman" w:cs="Times New Roman"/>
+              </w:rPr>
+            </w:pPr>
+            <w:r>
+              <w:rPr>
+                <w:rFonts w:ascii="Times New Roman" w:hAnsi="Times New Roman" w:cs="Times New Roman"/>
+              </w:rPr>
+              <w:t>docker logs &lt;container_id&gt;</w:t>
+            </w:r>
+          </w:p>
+          <w:p>
+            <w:pPr>
+              <w:rPr>
+                <w:rFonts w:ascii="Times New Roman" w:hAnsi="Times New Roman" w:cs="Times New Roman"/>
+              </w:rPr>
+            </w:pPr>
+            <w:r>
+              <w:rPr>
+                <w:rFonts w:ascii="Times New Roman" w:hAnsi="Times New Roman" w:cs="Times New Roman"/>
+              </w:rPr>
+              <w:lastRenderedPageBreak/>
+              <w:drawing>
+                <wp:inline distT="0" distB="0" distL="0" distR="0" wp14:anchorId="598C3ECC" wp14:editId="74520115">
+                  <wp:extent cx="5943600" cy="2883535"/>
+                  <wp:effectExtent l="0" t="0" r="0" b="0"/>
+                  <wp:docPr id="1706155306" name="Picture 1"/>
+                  <wp:cNvGraphicFramePr>
+                    <a:graphicFrameLocks xmlns:a="http://schemas.openxmlformats.org/drawingml/2006/main" noChangeAspect="1"/>
+                  </wp:cNvGraphicFramePr>
+                  <a:graphic xmlns:a="http://schemas.openxmlformats.org/drawingml/2006/main">
+                    <a:graphicData uri="http://schemas.openxmlformats.org/drawingml/2006/picture">
+                      <pic:pic xmlns:pic="http://schemas.openxmlformats.org/drawingml/2006/picture">
+                        <pic:nvPicPr>
+                          <pic:cNvPr id="1706155306" name=""/>
+                          <pic:cNvPicPr/>
+                        </pic:nvPicPr>
+                        <pic:blipFill>
+                          <a:blip r:embed="rId14"/>
+                          <a:stretch>
+                            <a:fillRect/>
+                          </a:stretch>
+                        </pic:blipFill>
+                        <pic:spPr>
+                          <a:xfrm>
+                            <a:off x="0" y="0"/>
+                            <a:ext cx="5943600" cy="2883535"/>
+                          </a:xfrm>
+                          <a:prstGeom prst="rect">
+                            <a:avLst/>
+                          </a:prstGeom>
+                        </pic:spPr>
+                      </pic:pic>
+                    </a:graphicData>
+                  </a:graphic>
+                </wp:inline>
+              </w:drawing>
+            </w:r>
+          </w:p>
+        </w:tc>
+      </w:tr>
+      <w:tr>
+        <w:trPr>
+          <w:trHeight w:val="315"/>
+        </w:trPr>
+        <w:tc>
+          <w:tcPr>
+            <w:tcW w:w="532" w:type="dxa"/>
+            <w:tcBorders>
+              <w:top w:val="single" w:sz="6" w:space="0" w:color="CCCCCC"/>
+              <w:left w:val="single" w:sz="6" w:space="0" w:color="CCCCCC"/>
+              <w:bottom w:val="single" w:sz="6" w:space="0" w:color="CCCCCC"/>
+              <w:right w:val="single" w:sz="6" w:space="0" w:color="CCCCCC"/>
+            </w:tcBorders>
+            <w:tcMar>
+              <w:top w:w="0" w:type="dxa"/>
+              <w:left w:w="45" w:type="dxa"/>
+              <w:bottom w:w="0" w:type="dxa"/>
+              <w:right w:w="45" w:type="dxa"/>
+            </w:tcMar>
+            <w:vAlign w:val="bottom"/>
+            <w:hideMark/>
+          </w:tcPr>
+          <w:p>
+            <w:pPr>
+              <w:rPr>
+                <w:rFonts w:ascii="Times New Roman" w:hAnsi="Times New Roman" w:cs="Times New Roman"/>
+              </w:rPr>
+            </w:pPr>
+            <w:r>
+              <w:rPr>
+                <w:rFonts w:ascii="Times New Roman" w:hAnsi="Times New Roman" w:cs="Times New Roman"/>
+              </w:rPr>
+              <w:lastRenderedPageBreak/>
+              <w:t>9</w:t>
+            </w:r>
+          </w:p>
+        </w:tc>
+        <w:tc>
+          <w:tcPr>
+            <w:tcW w:w="9360" w:type="dxa"/>
+            <w:tcBorders>
+              <w:top w:val="single" w:sz="6" w:space="0" w:color="CCCCCC"/>
+              <w:left w:val="single" w:sz="6" w:space="0" w:color="CCCCCC"/>
+              <w:bottom w:val="single" w:sz="6" w:space="0" w:color="CCCCCC"/>
+              <w:right w:val="single" w:sz="6" w:space="0" w:color="CCCCCC"/>
+            </w:tcBorders>
+            <w:tcMar>
+              <w:top w:w="0" w:type="dxa"/>
+              <w:left w:w="45" w:type="dxa"/>
+              <w:bottom w:w="0" w:type="dxa"/>
+              <w:right w:w="45" w:type="dxa"/>
+            </w:tcMar>
+            <w:vAlign w:val="bottom"/>
+            <w:hideMark/>
+          </w:tcPr>
+          <w:p>
+            <w:pPr>
+              <w:rPr>
+                <w:rFonts w:ascii="Times New Roman" w:hAnsi="Times New Roman" w:cs="Times New Roman"/>
+              </w:rPr>
+            </w:pPr>
+            <w:r>
+              <w:rPr>
+                <w:rFonts w:ascii="Times New Roman" w:hAnsi="Times New Roman" w:cs="Times New Roman"/>
+              </w:rPr>
+              <w:t>docker exec -it &lt;container_id&gt; /bin/sh</w:t>
+            </w:r>
+          </w:p>
+          <w:p>
+            <w:pPr>
+              <w:rPr>
+                <w:rFonts w:ascii="Times New Roman" w:hAnsi="Times New Roman" w:cs="Times New Roman"/>
+              </w:rPr>
+            </w:pPr>
+            <w:r>
+              <w:rPr>
+                <w:rFonts w:ascii="Times New Roman" w:hAnsi="Times New Roman" w:cs="Times New Roman"/>
+              </w:rPr>
+              <w:drawing>
+                <wp:inline distT="0" distB="0" distL="0" distR="0" wp14:anchorId="5EC85B10" wp14:editId="475A6BA6">
+                  <wp:extent cx="5839640" cy="457264"/>
+                  <wp:effectExtent l="0" t="0" r="0" b="0"/>
+                  <wp:docPr id="713768576" name="Picture 1"/>
+                  <wp:cNvGraphicFramePr>
+                    <a:graphicFrameLocks xmlns:a="http://schemas.openxmlformats.org/drawingml/2006/main" noChangeAspect="1"/>
+                  </wp:cNvGraphicFramePr>
+                  <a:graphic xmlns:a="http://schemas.openxmlformats.org/drawingml/2006/main">
+                    <a:graphicData uri="http://schemas.openxmlformats.org/drawingml/2006/picture">
+                      <pic:pic xmlns:pic="http://schemas.openxmlformats.org/drawingml/2006/picture">
+                        <pic:nvPicPr>
+                          <pic:cNvPr id="713768576" name=""/>
+                          <pic:cNvPicPr/>
+                        </pic:nvPicPr>
+                        <pic:blipFill>
+                          <a:blip r:embed="rId15"/>
+                          <a:stretch>
+                            <a:fillRect/>
+                          </a:stretch>
+                        </pic:blipFill>
+                        <pic:spPr>
+                          <a:xfrm>
+                            <a:off x="0" y="0"/>
+                            <a:ext cx="5839640" cy="457264"/>
+                          </a:xfrm>
+                          <a:prstGeom prst="rect">
+                            <a:avLst/>
+                          </a:prstGeom>
+                        </pic:spPr>
+                      </pic:pic>
+                    </a:graphicData>
+                  </a:graphic>
+                </wp:inline>
+              </w:drawing>
+            </w:r>
+          </w:p>
+        </w:tc>
+      </w:tr>
+      <w:tr>
+        <w:trPr>
+          <w:trHeight w:val="315"/>
+        </w:trPr>
+        <w:tc>
+          <w:tcPr>
+            <w:tcW w:w="532" w:type="dxa"/>
+            <w:tcBorders>
+              <w:top w:val="single" w:sz="6" w:space="0" w:color="CCCCCC"/>
+              <w:left w:val="single" w:sz="6" w:space="0" w:color="CCCCCC"/>
+              <w:bottom w:val="single" w:sz="6" w:space="0" w:color="CCCCCC"/>
+              <w:right w:val="single" w:sz="6" w:space="0" w:color="CCCCCC"/>
+            </w:tcBorders>
+            <w:tcMar>
+              <w:top w:w="0" w:type="dxa"/>
+              <w:left w:w="45" w:type="dxa"/>
+              <w:bottom w:w="0" w:type="dxa"/>
+              <w:right w:w="45" w:type="dxa"/>
+            </w:tcMar>
+            <w:vAlign w:val="bottom"/>
+            <w:hideMark/>
+          </w:tcPr>
+          <w:p>
+            <w:pPr>
+              <w:rPr>
+                <w:rFonts w:ascii="Times New Roman" w:hAnsi="Times New Roman" w:cs="Times New Roman"/>
+              </w:rPr>
+            </w:pPr>
+            <w:r>
+              <w:rPr>
+                <w:rFonts w:ascii="Times New Roman" w:hAnsi="Times New Roman" w:cs="Times New Roman"/>
+              </w:rPr>
+              <w:t>10</w:t>
+            </w:r>
+          </w:p>
+        </w:tc>
+        <w:tc>
+          <w:tcPr>
+            <w:tcW w:w="9360" w:type="dxa"/>
+            <w:tcBorders>
+              <w:top w:val="single" w:sz="6" w:space="0" w:color="CCCCCC"/>
+              <w:left w:val="single" w:sz="6" w:space="0" w:color="CCCCCC"/>
+              <w:bottom w:val="single" w:sz="6" w:space="0" w:color="CCCCCC"/>
+              <w:right w:val="single" w:sz="6" w:space="0" w:color="CCCCCC"/>
+            </w:tcBorders>
+            <w:tcMar>
+              <w:top w:w="0" w:type="dxa"/>
+              <w:left w:w="45" w:type="dxa"/>
+              <w:bottom w:w="0" w:type="dxa"/>
+              <w:right w:w="45" w:type="dxa"/>
+            </w:tcMar>
+            <w:vAlign w:val="bottom"/>
+            <w:hideMark/>
+          </w:tcPr>
+          <w:p>
+            <w:pPr>
+              <w:rPr>
+                <w:rFonts w:ascii="Times New Roman" w:hAnsi="Times New Roman" w:cs="Times New Roman"/>
+              </w:rPr>
+            </w:pPr>
+            <w:r>
+              <w:rPr>
+                <w:rFonts w:ascii="Times New Roman" w:hAnsi="Times New Roman" w:cs="Times New Roman"/>
+              </w:rPr>
+              <w:t>docker stop &lt;container_id&gt;</w:t>
+            </w:r>
+          </w:p>
+          <w:p>
+            <w:pPr>
+              <w:rPr>
+                <w:rFonts w:ascii="Times New Roman" w:hAnsi="Times New Roman" w:cs="Times New Roman"/>
+              </w:rPr>
+            </w:pPr>
+            <w:r>
+              <w:rPr>
+                <w:rFonts w:ascii="Times New Roman" w:hAnsi="Times New Roman" w:cs="Times New Roman"/>
+              </w:rPr>
+              <w:drawing>
+                <wp:inline distT="0" distB="0" distL="0" distR="0" wp14:anchorId="40EA2599" wp14:editId="71B13486">
+                  <wp:extent cx="5163271" cy="419158"/>
+                  <wp:effectExtent l="0" t="0" r="0" b="0"/>
+                  <wp:docPr id="2116549023" name="Picture 1"/>
+                  <wp:cNvGraphicFramePr>
+                    <a:graphicFrameLocks xmlns:a="http://schemas.openxmlformats.org/drawingml/2006/main" noChangeAspect="1"/>
+                  </wp:cNvGraphicFramePr>
+                  <a:graphic xmlns:a="http://schemas.openxmlformats.org/drawingml/2006/main">
+                    <a:graphicData uri="http://schemas.openxmlformats.org/drawingml/2006/picture">
+                      <pic:pic xmlns:pic="http://schemas.openxmlformats.org/drawingml/2006/picture">
+                        <pic:nvPicPr>
+                          <pic:cNvPr id="2116549023" name=""/>
+                          <pic:cNvPicPr/>
+                        </pic:nvPicPr>
+                        <pic:blipFill>
+                          <a:blip r:embed="rId16"/>
+                          <a:stretch>
+                            <a:fillRect/>
+                          </a:stretch>
+                        </pic:blipFill>
+                        <pic:spPr>
+                          <a:xfrm>
+                            <a:off x="0" y="0"/>
+                            <a:ext cx="5163271" cy="419158"/>
+                          </a:xfrm>
+                          <a:prstGeom prst="rect">
+                            <a:avLst/>
+                          </a:prstGeom>
+                        </pic:spPr>
+                      </pic:pic>
+                    </a:graphicData>
+                  </a:graphic>
+                </wp:inline>
+              </w:drawing>
+            </w:r>
+          </w:p>
+        </w:tc>
+      </w:tr>
+      <w:tr>
+        <w:trPr>
+          <w:trHeight w:val="315"/>
+        </w:trPr>
+        <w:tc>
+          <w:tcPr>
+            <w:tcW w:w="532" w:type="dxa"/>
+            <w:tcBorders>
+              <w:top w:val="single" w:sz="6" w:space="0" w:color="CCCCCC"/>
+              <w:left w:val="single" w:sz="6" w:space="0" w:color="CCCCCC"/>
+              <w:bottom w:val="single" w:sz="6" w:space="0" w:color="CCCCCC"/>
+              <w:right w:val="single" w:sz="6" w:space="0" w:color="CCCCCC"/>
+            </w:tcBorders>
+            <w:tcMar>
+              <w:top w:w="0" w:type="dxa"/>
+              <w:left w:w="45" w:type="dxa"/>
+              <w:bottom w:w="0" w:type="dxa"/>
+              <w:right w:w="45" w:type="dxa"/>
+            </w:tcMar>
+            <w:vAlign w:val="bottom"/>
+            <w:hideMark/>
+          </w:tcPr>
+          <w:p>
+            <w:pPr>
+              <w:rPr>
+                <w:rFonts w:ascii="Times New Roman" w:hAnsi="Times New Roman" w:cs="Times New Roman"/>
+              </w:rPr>
+            </w:pPr>
+            <w:r>
+              <w:rPr>
+                <w:rFonts w:ascii="Times New Roman" w:hAnsi="Times New Roman" w:cs="Times New Roman"/>
+              </w:rPr>
+              <w:t>11</w:t>
+            </w:r>
+          </w:p>
+        </w:tc>
+        <w:tc>
+          <w:tcPr>
+            <w:tcW w:w="9360" w:type="dxa"/>
+            <w:tcBorders>
+              <w:top w:val="single" w:sz="6" w:space="0" w:color="CCCCCC"/>
+              <w:left w:val="single" w:sz="6" w:space="0" w:color="CCCCCC"/>
+              <w:bottom w:val="single" w:sz="6" w:space="0" w:color="CCCCCC"/>
+              <w:right w:val="single" w:sz="6" w:space="0" w:color="CCCCCC"/>
+            </w:tcBorders>
+            <w:tcMar>
+              <w:top w:w="0" w:type="dxa"/>
+              <w:left w:w="45" w:type="dxa"/>
+              <w:bottom w:w="0" w:type="dxa"/>
+              <w:right w:w="45" w:type="dxa"/>
+            </w:tcMar>
+            <w:vAlign w:val="bottom"/>
+            <w:hideMark/>
+          </w:tcPr>
+          <w:p>
+            <w:pPr>
+              <w:rPr>
+                <w:rFonts w:ascii="Times New Roman" w:hAnsi="Times New Roman" w:cs="Times New Roman"/>
+              </w:rPr>
+            </w:pPr>
+            <w:r>
+              <w:rPr>
+                <w:rFonts w:ascii="Times New Roman" w:hAnsi="Times New Roman" w:cs="Times New Roman"/>
+              </w:rPr>
+              <w:t>docker restart &lt;container_id&gt;</w:t>
+            </w:r>
+          </w:p>
+          <w:p>
+            <w:pPr>
+              <w:rPr>
+                <w:rFonts w:ascii="Times New Roman" w:hAnsi="Times New Roman" w:cs="Times New Roman"/>
+              </w:rPr>
+            </w:pPr>
+            <w:r>
+              <w:rPr>
+                <w:rFonts w:ascii="Times New Roman" w:hAnsi="Times New Roman" w:cs="Times New Roman"/>
+              </w:rPr>
+              <w:drawing>
+                <wp:inline distT="0" distB="0" distL="0" distR="0" wp14:anchorId="287FEF1D" wp14:editId="4F04EAB3">
+                  <wp:extent cx="5943600" cy="779145"/>
+                  <wp:effectExtent l="0" t="0" r="0" b="1905"/>
+                  <wp:docPr id="1138823966" name="Picture 1"/>
+                  <wp:cNvGraphicFramePr>
+                    <a:graphicFrameLocks xmlns:a="http://schemas.openxmlformats.org/drawingml/2006/main" noChangeAspect="1"/>
+                  </wp:cNvGraphicFramePr>
+                  <a:graphic xmlns:a="http://schemas.openxmlformats.org/drawingml/2006/main">
+                    <a:graphicData uri="http://schemas.openxmlformats.org/drawingml/2006/picture">
+                      <pic:pic xmlns:pic="http://schemas.openxmlformats.org/drawingml/2006/picture">
+                        <pic:nvPicPr>
+                          <pic:cNvPr id="1138823966" name=""/>
+                          <pic:cNvPicPr/>
+                        </pic:nvPicPr>
+                        <pic:blipFill>
+                          <a:blip r:embed="rId17"/>
+                          <a:stretch>
+                            <a:fillRect/>
+                          </a:stretch>
+                        </pic:blipFill>
+                        <pic:spPr>
+                          <a:xfrm>
+                            <a:off x="0" y="0"/>
+                            <a:ext cx="5943600" cy="779145"/>
+                          </a:xfrm>
+                          <a:prstGeom prst="rect">
+                            <a:avLst/>
+                          </a:prstGeom>
+                        </pic:spPr>
+                      </pic:pic>
+                    </a:graphicData>
+                  </a:graphic>
+                </wp:inline>
+              </w:drawing>
+            </w:r>
+          </w:p>
+        </w:tc>
+      </w:tr>
+      <w:tr>
+        <w:trPr>
+          <w:trHeight w:val="315"/>
+        </w:trPr>
+        <w:tc>
+          <w:tcPr>
+            <w:tcW w:w="532" w:type="dxa"/>
+            <w:tcBorders>
+              <w:top w:val="single" w:sz="6" w:space="0" w:color="CCCCCC"/>
+              <w:left w:val="single" w:sz="6" w:space="0" w:color="CCCCCC"/>
+              <w:bottom w:val="single" w:sz="6" w:space="0" w:color="CCCCCC"/>
+              <w:right w:val="single" w:sz="6" w:space="0" w:color="CCCCCC"/>
+            </w:tcBorders>
+            <w:tcMar>
+              <w:top w:w="0" w:type="dxa"/>
+              <w:left w:w="45" w:type="dxa"/>
+              <w:bottom w:w="0" w:type="dxa"/>
+              <w:right w:w="45" w:type="dxa"/>
+            </w:tcMar>
+            <w:vAlign w:val="bottom"/>
+            <w:hideMark/>
+          </w:tcPr>
+          <w:p>
+            <w:pPr>
+              <w:rPr>
+                <w:rFonts w:ascii="Times New Roman" w:hAnsi="Times New Roman" w:cs="Times New Roman"/>
+              </w:rPr>
+            </w:pPr>
+            <w:r>
+              <w:rPr>
+                <w:rFonts w:ascii="Times New Roman" w:hAnsi="Times New Roman" w:cs="Times New Roman"/>
+              </w:rPr>
+              <w:t>12</w:t>
+            </w:r>
+          </w:p>
+        </w:tc>
+        <w:tc>
+          <w:tcPr>
+            <w:tcW w:w="9360" w:type="dxa"/>
+            <w:tcBorders>
+              <w:top w:val="single" w:sz="6" w:space="0" w:color="CCCCCC"/>
+              <w:left w:val="single" w:sz="6" w:space="0" w:color="CCCCCC"/>
+              <w:bottom w:val="single" w:sz="6" w:space="0" w:color="CCCCCC"/>
+              <w:right w:val="single" w:sz="6" w:space="0" w:color="CCCCCC"/>
+            </w:tcBorders>
+            <w:tcMar>
+              <w:top w:w="0" w:type="dxa"/>
+              <w:left w:w="45" w:type="dxa"/>
+              <w:bottom w:w="0" w:type="dxa"/>
+              <w:right w:w="45" w:type="dxa"/>
+            </w:tcMar>
+            <w:vAlign w:val="bottom"/>
+            <w:hideMark/>
+          </w:tcPr>
+          <w:p>
+            <w:pPr>
+              <w:rPr>
+                <w:rFonts w:ascii="Times New Roman" w:hAnsi="Times New Roman" w:cs="Times New Roman"/>
+              </w:rPr>
+            </w:pPr>
+            <w:r>
+              <w:rPr>
+                <w:rFonts w:ascii="Times New Roman" w:hAnsi="Times New Roman" w:cs="Times New Roman"/>
+              </w:rPr>
+              <w:t>docker rm &lt;container_id&gt;</w:t>
+            </w:r>
+          </w:p>
+          <w:p>
+            <w:pPr>
+              <w:rPr>
+                <w:rFonts w:ascii="Times New Roman" w:hAnsi="Times New Roman" w:cs="Times New Roman"/>
+              </w:rPr>
+            </w:pPr>
+            <w:r>
+              <w:rPr>
+                <w:rFonts w:ascii="Times New Roman" w:hAnsi="Times New Roman" w:cs="Times New Roman"/>
+              </w:rPr>
+              <w:drawing>
+                <wp:inline distT="0" distB="0" distL="0" distR="0" wp14:anchorId="5764D92D" wp14:editId="52EC6505">
+                  <wp:extent cx="4477375" cy="476316"/>
+                  <wp:effectExtent l="0" t="0" r="0" b="0"/>
+                  <wp:docPr id="438999259" name="Picture 1"/>
+                  <wp:cNvGraphicFramePr>
+                    <a:graphicFrameLocks xmlns:a="http://schemas.openxmlformats.org/drawingml/2006/main" noChangeAspect="1"/>
+                  </wp:cNvGraphicFramePr>
+                  <a:graphic xmlns:a="http://schemas.openxmlformats.org/drawingml/2006/main">
+                    <a:graphicData uri="http://schemas.openxmlformats.org/drawingml/2006/picture">
+                      <pic:pic xmlns:pic="http://schemas.openxmlformats.org/drawingml/2006/picture">
+                        <pic:nvPicPr>
+                          <pic:cNvPr id="438999259" name=""/>
+                          <pic:cNvPicPr/>
+                        </pic:nvPicPr>
+                        <pic:blipFill>
+                          <a:blip r:embed="rId18"/>
+                          <a:stretch>
+                            <a:fillRect/>
+                          </a:stretch>
+                        </pic:blipFill>
+                        <pic:spPr>
+                          <a:xfrm>
+                            <a:off x="0" y="0"/>
+                            <a:ext cx="4477375" cy="476316"/>
+                          </a:xfrm>
+                          <a:prstGeom prst="rect">
+                            <a:avLst/>
+                          </a:prstGeom>
+                        </pic:spPr>
+                      </pic:pic>
+                    </a:graphicData>
+                  </a:graphic>
+                </wp:inline>
+              </w:drawing>
+            </w:r>
+          </w:p>
+        </w:tc>
+      </w:tr>
+      <w:tr>
+        <w:trPr>
+          <w:trHeight w:val="315"/>
+        </w:trPr>
+        <w:tc>
+          <w:tcPr>
+            <w:tcW w:w="532" w:type="dxa"/>
+            <w:tcBorders>
+              <w:top w:val="single" w:sz="6" w:space="0" w:color="CCCCCC"/>
+              <w:left w:val="single" w:sz="6" w:space="0" w:color="CCCCCC"/>
+              <w:bottom w:val="single" w:sz="6" w:space="0" w:color="CCCCCC"/>
+              <w:right w:val="single" w:sz="6" w:space="0" w:color="CCCCCC"/>
+            </w:tcBorders>
+            <w:tcMar>
+              <w:top w:w="0" w:type="dxa"/>
+              <w:left w:w="45" w:type="dxa"/>
+              <w:bottom w:w="0" w:type="dxa"/>
+              <w:right w:w="45" w:type="dxa"/>
+            </w:tcMar>
+            <w:vAlign w:val="bottom"/>
+            <w:hideMark/>
+          </w:tcPr>
+          <w:p>
+            <w:pPr>
+              <w:rPr>
+                <w:rFonts w:ascii="Times New Roman" w:hAnsi="Times New Roman" w:cs="Times New Roman"/>
+              </w:rPr>
+            </w:pPr>
+            <w:r>
+              <w:rPr>
+                <w:rFonts w:ascii="Times New Roman" w:hAnsi="Times New Roman" w:cs="Times New Roman"/>
+              </w:rPr>
+              <w:t>13</w:t>
+            </w:r>
+          </w:p>
+        </w:tc>
+        <w:tc>
+          <w:tcPr>
+            <w:tcW w:w="9360" w:type="dxa"/>
+            <w:tcBorders>
+              <w:top w:val="single" w:sz="6" w:space="0" w:color="CCCCCC"/>
+              <w:left w:val="single" w:sz="6" w:space="0" w:color="CCCCCC"/>
+              <w:bottom w:val="single" w:sz="6" w:space="0" w:color="CCCCCC"/>
+              <w:right w:val="single" w:sz="6" w:space="0" w:color="CCCCCC"/>
+            </w:tcBorders>
+            <w:tcMar>
+              <w:top w:w="0" w:type="dxa"/>
+              <w:left w:w="45" w:type="dxa"/>
+              <w:bottom w:w="0" w:type="dxa"/>
+              <w:right w:w="45" w:type="dxa"/>
+            </w:tcMar>
+            <w:vAlign w:val="bottom"/>
+            <w:hideMark/>
+          </w:tcPr>
+          <w:p>
+            <w:pPr>
+              <w:rPr>
+                <w:rFonts w:ascii="Times New Roman" w:hAnsi="Times New Roman" w:cs="Times New Roman"/>
+              </w:rPr>
+            </w:pPr>
+            <w:r>
+              <w:rPr>
+                <w:rFonts w:ascii="Times New Roman" w:hAnsi="Times New Roman" w:cs="Times New Roman"/>
+              </w:rPr>
+              <w:t>docker container prune</w:t>
+            </w:r>
+          </w:p>
+          <w:p>
+            <w:pPr>
+              <w:rPr>
+                <w:rFonts w:ascii="Times New Roman" w:hAnsi="Times New Roman" w:cs="Times New Roman"/>
+              </w:rPr>
+            </w:pPr>
+            <w:r>
+              <w:rPr>
+                <w:rFonts w:ascii="Times New Roman" w:hAnsi="Times New Roman" w:cs="Times New Roman"/>
+              </w:rPr>
+              <w:lastRenderedPageBreak/>
+              <w:drawing>
+                <wp:inline distT="0" distB="0" distL="0" distR="0" wp14:anchorId="30193577" wp14:editId="5224F550">
+                  <wp:extent cx="5048955" cy="724001"/>
+                  <wp:effectExtent l="0" t="0" r="0" b="0"/>
+                  <wp:docPr id="594387386" name="Picture 1"/>
+                  <wp:cNvGraphicFramePr>
+                    <a:graphicFrameLocks xmlns:a="http://schemas.openxmlformats.org/drawingml/2006/main" noChangeAspect="1"/>
+                  </wp:cNvGraphicFramePr>
+                  <a:graphic xmlns:a="http://schemas.openxmlformats.org/drawingml/2006/main">
+                    <a:graphicData uri="http://schemas.openxmlformats.org/drawingml/2006/picture">
+                      <pic:pic xmlns:pic="http://schemas.openxmlformats.org/drawingml/2006/picture">
+                        <pic:nvPicPr>
+                          <pic:cNvPr id="594387386" name=""/>
+                          <pic:cNvPicPr/>
+                        </pic:nvPicPr>
+                        <pic:blipFill>
+                          <a:blip r:embed="rId19"/>
+                          <a:stretch>
+                            <a:fillRect/>
+                          </a:stretch>
+                        </pic:blipFill>
+                        <pic:spPr>
+                          <a:xfrm>
+                            <a:off x="0" y="0"/>
+                            <a:ext cx="5048955" cy="724001"/>
+                          </a:xfrm>
+                          <a:prstGeom prst="rect">
+                            <a:avLst/>
+                          </a:prstGeom>
+                        </pic:spPr>
+                      </pic:pic>
+                    </a:graphicData>
+                  </a:graphic>
+                </wp:inline>
+              </w:drawing>
+            </w:r>
+          </w:p>
+        </w:tc>
+      </w:tr>
+      <w:tr>
+        <w:trPr>
+          <w:trHeight w:val="315"/>
+        </w:trPr>
+        <w:tc>
+          <w:tcPr>
+            <w:tcW w:w="532" w:type="dxa"/>
+            <w:tcBorders>
+              <w:top w:val="single" w:sz="6" w:space="0" w:color="CCCCCC"/>
+              <w:left w:val="single" w:sz="6" w:space="0" w:color="CCCCCC"/>
+              <w:bottom w:val="single" w:sz="6" w:space="0" w:color="CCCCCC"/>
+              <w:right w:val="single" w:sz="6" w:space="0" w:color="CCCCCC"/>
+            </w:tcBorders>
+            <w:tcMar>
+              <w:top w:w="0" w:type="dxa"/>
+              <w:left w:w="45" w:type="dxa"/>
+              <w:bottom w:w="0" w:type="dxa"/>
+              <w:right w:w="45" w:type="dxa"/>
+            </w:tcMar>
+            <w:vAlign w:val="bottom"/>
+            <w:hideMark/>
+          </w:tcPr>
+          <w:p>
+            <w:pPr>
+              <w:rPr>
+                <w:rFonts w:ascii="Times New Roman" w:hAnsi="Times New Roman" w:cs="Times New Roman"/>
+              </w:rPr>
+            </w:pPr>
+            <w:r>
+              <w:rPr>
+                <w:rFonts w:ascii="Times New Roman" w:hAnsi="Times New Roman" w:cs="Times New Roman"/>
+              </w:rPr>
+              <w:lastRenderedPageBreak/>
+              <w:t>14</w:t>
+            </w:r>
+          </w:p>
+        </w:tc>
+        <w:tc>
+          <w:tcPr>
+            <w:tcW w:w="9360" w:type="dxa"/>
+            <w:tcBorders>
+              <w:top w:val="single" w:sz="6" w:space="0" w:color="CCCCCC"/>
+              <w:left w:val="single" w:sz="6" w:space="0" w:color="CCCCCC"/>
+              <w:bottom w:val="single" w:sz="6" w:space="0" w:color="CCCCCC"/>
+              <w:right w:val="single" w:sz="6" w:space="0" w:color="CCCCCC"/>
+            </w:tcBorders>
+            <w:tcMar>
+              <w:top w:w="0" w:type="dxa"/>
+              <w:left w:w="45" w:type="dxa"/>
+              <w:bottom w:w="0" w:type="dxa"/>
+              <w:right w:w="45" w:type="dxa"/>
+            </w:tcMar>
+            <w:vAlign w:val="bottom"/>
+            <w:hideMark/>
+          </w:tcPr>
+          <w:p>
+            <w:pPr>
+              <w:rPr>
+                <w:rFonts w:ascii="Times New Roman" w:hAnsi="Times New Roman" w:cs="Times New Roman"/>
+              </w:rPr>
+            </w:pPr>
+            <w:r>
+              <w:rPr>
+                <w:rFonts w:ascii="Times New Roman" w:hAnsi="Times New Roman" w:cs="Times New Roman"/>
+              </w:rPr>
+              <w:t>docker rmi &lt;image_id&gt;</w:t>
+            </w:r>
+          </w:p>
+          <w:p>
+            <w:pPr>
+              <w:rPr>
+                <w:rFonts w:ascii="Times New Roman" w:hAnsi="Times New Roman" w:cs="Times New Roman"/>
+              </w:rPr>
+            </w:pPr>
+            <w:r>
+              <w:rPr>
+                <w:rFonts w:ascii="Times New Roman" w:hAnsi="Times New Roman" w:cs="Times New Roman"/>
+              </w:rPr>
+              <w:drawing>
+                <wp:inline distT="0" distB="0" distL="0" distR="0" wp14:anchorId="05FE1DAA" wp14:editId="00C4BCD5">
+                  <wp:extent cx="5943600" cy="551815"/>
+                  <wp:effectExtent l="0" t="0" r="0" b="635"/>
+                  <wp:docPr id="21702215" name="Picture 1"/>
+                  <wp:cNvGraphicFramePr>
+                    <a:graphicFrameLocks xmlns:a="http://schemas.openxmlformats.org/drawingml/2006/main" noChangeAspect="1"/>
+                  </wp:cNvGraphicFramePr>
+                  <a:graphic xmlns:a="http://schemas.openxmlformats.org/drawingml/2006/main">
+                    <a:graphicData uri="http://schemas.openxmlformats.org/drawingml/2006/picture">
+                      <pic:pic xmlns:pic="http://schemas.openxmlformats.org/drawingml/2006/picture">
+                        <pic:nvPicPr>
+                          <pic:cNvPr id="21702215" name=""/>
+                          <pic:cNvPicPr/>
+                        </pic:nvPicPr>
+                        <pic:blipFill>
+                          <a:blip r:embed="rId20"/>
+                          <a:stretch>
+                            <a:fillRect/>
+                          </a:stretch>
+                        </pic:blipFill>
+                        <pic:spPr>
+                          <a:xfrm>
+                            <a:off x="0" y="0"/>
+                            <a:ext cx="5943600" cy="551815"/>
+                          </a:xfrm>
+                          <a:prstGeom prst="rect">
+                            <a:avLst/>
+                          </a:prstGeom>
+                        </pic:spPr>
+                      </pic:pic>
+                    </a:graphicData>
+                  </a:graphic>
+                </wp:inline>
+              </w:drawing>
+            </w:r>
+          </w:p>
+        </w:tc>
+      </w:tr>
+      <w:tr>
+        <w:trPr>
+          <w:trHeight w:val="315"/>
+        </w:trPr>
+        <w:tc>
+          <w:tcPr>
+            <w:tcW w:w="532" w:type="dxa"/>
+            <w:tcBorders>
+              <w:top w:val="single" w:sz="6" w:space="0" w:color="CCCCCC"/>
+              <w:left w:val="single" w:sz="6" w:space="0" w:color="CCCCCC"/>
+              <w:bottom w:val="single" w:sz="6" w:space="0" w:color="CCCCCC"/>
+              <w:right w:val="single" w:sz="6" w:space="0" w:color="CCCCCC"/>
+            </w:tcBorders>
+            <w:tcMar>
+              <w:top w:w="0" w:type="dxa"/>
+              <w:left w:w="45" w:type="dxa"/>
+              <w:bottom w:w="0" w:type="dxa"/>
+              <w:right w:w="45" w:type="dxa"/>
+            </w:tcMar>
+            <w:vAlign w:val="bottom"/>
+            <w:hideMark/>
+          </w:tcPr>
+          <w:p>
+            <w:pPr>
+              <w:rPr>
+                <w:rFonts w:ascii="Times New Roman" w:hAnsi="Times New Roman" w:cs="Times New Roman"/>
+              </w:rPr>
+            </w:pPr>
+            <w:r>
+              <w:rPr>
+                <w:rFonts w:ascii="Times New Roman" w:hAnsi="Times New Roman" w:cs="Times New Roman"/>
+              </w:rPr>
+              <w:t>15</w:t>
+            </w:r>
+          </w:p>
+        </w:tc>
+        <w:tc>
+          <w:tcPr>
+            <w:tcW w:w="9360" w:type="dxa"/>
+            <w:tcBorders>
+              <w:top w:val="single" w:sz="6" w:space="0" w:color="CCCCCC"/>
+              <w:left w:val="single" w:sz="6" w:space="0" w:color="CCCCCC"/>
+              <w:bottom w:val="single" w:sz="6" w:space="0" w:color="CCCCCC"/>
+              <w:right w:val="single" w:sz="6" w:space="0" w:color="CCCCCC"/>
+            </w:tcBorders>
+            <w:tcMar>
+              <w:top w:w="0" w:type="dxa"/>
+              <w:left w:w="45" w:type="dxa"/>
+              <w:bottom w:w="0" w:type="dxa"/>
+              <w:right w:w="45" w:type="dxa"/>
+            </w:tcMar>
+            <w:vAlign w:val="bottom"/>
+            <w:hideMark/>
+          </w:tcPr>
+          <w:p>
+            <w:pPr>
+              <w:rPr>
+                <w:rFonts w:ascii="Times New Roman" w:hAnsi="Times New Roman" w:cs="Times New Roman"/>
+              </w:rPr>
+            </w:pPr>
+            <w:r>
+              <w:rPr>
+                <w:rFonts w:ascii="Times New Roman" w:hAnsi="Times New Roman" w:cs="Times New Roman"/>
+              </w:rPr>
+              <w:t>docker image prune -a</w:t>
+            </w:r>
+          </w:p>
+          <w:p>
+            <w:pPr>
+              <w:rPr>
+                <w:rFonts w:ascii="Times New Roman" w:hAnsi="Times New Roman" w:cs="Times New Roman"/>
+              </w:rPr>
+            </w:pPr>
+            <w:r>
+              <w:rPr>
+                <w:rFonts w:ascii="Times New Roman" w:hAnsi="Times New Roman" w:cs="Times New Roman"/>
+              </w:rPr>
+              <w:drawing>
+                <wp:inline distT="0" distB="0" distL="0" distR="0" wp14:anchorId="063E0C32" wp14:editId="156696EF">
+                  <wp:extent cx="5943600" cy="492760"/>
+                  <wp:effectExtent l="0" t="0" r="0" b="2540"/>
+                  <wp:docPr id="637202314" name="Picture 1"/>
+                  <wp:cNvGraphicFramePr>
+                    <a:graphicFrameLocks xmlns:a="http://schemas.openxmlformats.org/drawingml/2006/main" noChangeAspect="1"/>
+                  </wp:cNvGraphicFramePr>
+                  <a:graphic xmlns:a="http://schemas.openxmlformats.org/drawingml/2006/main">
+                    <a:graphicData uri="http://schemas.openxmlformats.org/drawingml/2006/picture">
+                      <pic:pic xmlns:pic="http://schemas.openxmlformats.org/drawingml/2006/picture">
+                        <pic:nvPicPr>
+                          <pic:cNvPr id="637202314" name=""/>
+                          <pic:cNvPicPr/>
+                        </pic:nvPicPr>
+                        <pic:blipFill>
+                          <a:blip r:embed="rId21"/>
+                          <a:stretch>
+                            <a:fillRect/>
+                          </a:stretch>
+                        </pic:blipFill>
+                        <pic:spPr>
+                          <a:xfrm>
+                            <a:off x="0" y="0"/>
+                            <a:ext cx="5943600" cy="492760"/>
+                          </a:xfrm>
+                          <a:prstGeom prst="rect">
+                            <a:avLst/>
+                          </a:prstGeom>
+                        </pic:spPr>
+                      </pic:pic>
+                    </a:graphicData>
+                  </a:graphic>
+                </wp:inline>
+              </w:drawing>
+            </w:r>
+          </w:p>
+        </w:tc>
+      </w:tr>
+      <w:tr>
+        <w:trPr>
+          <w:trHeight w:val="315"/>
+        </w:trPr>
+        <w:tc>
+          <w:tcPr>
+            <w:tcW w:w="532" w:type="dxa"/>
+            <w:tcBorders>
+              <w:top w:val="single" w:sz="6" w:space="0" w:color="CCCCCC"/>
+              <w:left w:val="single" w:sz="6" w:space="0" w:color="CCCCCC"/>
+              <w:bottom w:val="single" w:sz="6" w:space="0" w:color="CCCCCC"/>
+              <w:right w:val="single" w:sz="6" w:space="0" w:color="CCCCCC"/>
+            </w:tcBorders>
+            <w:tcMar>
+              <w:top w:w="0" w:type="dxa"/>
+              <w:left w:w="45" w:type="dxa"/>
+              <w:bottom w:w="0" w:type="dxa"/>
+              <w:right w:w="45" w:type="dxa"/>
+            </w:tcMar>
+            <w:vAlign w:val="bottom"/>
+            <w:hideMark/>
+          </w:tcPr>
+          <w:p>
+            <w:pPr>
+              <w:rPr>
+                <w:rFonts w:ascii="Times New Roman" w:hAnsi="Times New Roman" w:cs="Times New Roman"/>
+              </w:rPr>
+            </w:pPr>
+            <w:r>
+              <w:rPr>
+                <w:rFonts w:ascii="Times New Roman" w:hAnsi="Times New Roman" w:cs="Times New Roman"/>
+              </w:rPr>
+              <w:t>16</w:t>
+            </w:r>
+          </w:p>
+        </w:tc>
+        <w:tc>
+          <w:tcPr>
+            <w:tcW w:w="9360" w:type="dxa"/>
+            <w:tcBorders>
+              <w:top w:val="single" w:sz="6" w:space="0" w:color="CCCCCC"/>
+              <w:left w:val="single" w:sz="6" w:space="0" w:color="CCCCCC"/>
+              <w:bottom w:val="single" w:sz="6" w:space="0" w:color="CCCCCC"/>
+              <w:right w:val="single" w:sz="6" w:space="0" w:color="CCCCCC"/>
+            </w:tcBorders>
+            <w:tcMar>
+              <w:top w:w="0" w:type="dxa"/>
+              <w:left w:w="45" w:type="dxa"/>
+              <w:bottom w:w="0" w:type="dxa"/>
+              <w:right w:w="45" w:type="dxa"/>
+            </w:tcMar>
+            <w:vAlign w:val="bottom"/>
+            <w:hideMark/>
+          </w:tcPr>
+          <w:p>
+            <w:pPr>
+              <w:rPr>
+                <w:rFonts w:ascii="Times New Roman" w:hAnsi="Times New Roman" w:cs="Times New Roman"/>
+              </w:rPr>
+            </w:pPr>
+            <w:r>
+              <w:rPr>
+                <w:rFonts w:ascii="Times New Roman" w:hAnsi="Times New Roman" w:cs="Times New Roman"/>
+              </w:rPr>
+              <w:t>docker run -d -p 8080:80 nginx</w:t>
+            </w:r>
+          </w:p>
+          <w:p>
+            <w:pPr>
+              <w:rPr>
+                <w:rFonts w:ascii="Times New Roman" w:hAnsi="Times New Roman" w:cs="Times New Roman"/>
+              </w:rPr>
+            </w:pPr>
+            <w:r>
+              <w:rPr>
+                <w:rFonts w:ascii="Times New Roman" w:hAnsi="Times New Roman" w:cs="Times New Roman"/>
+              </w:rPr>
+              <w:drawing>
+                <wp:inline distT="0" distB="0" distL="0" distR="0" wp14:anchorId="7B754E34" wp14:editId="5E4618ED">
+                  <wp:extent cx="5696745" cy="543001"/>
+                  <wp:effectExtent l="0" t="0" r="0" b="9525"/>
+                  <wp:docPr id="1380825861" name="Picture 1"/>
+                  <wp:cNvGraphicFramePr>
+                    <a:graphicFrameLocks xmlns:a="http://schemas.openxmlformats.org/drawingml/2006/main" noChangeAspect="1"/>
+                  </wp:cNvGraphicFramePr>
+                  <a:graphic xmlns:a="http://schemas.openxmlformats.org/drawingml/2006/main">
+                    <a:graphicData uri="http://schemas.openxmlformats.org/drawingml/2006/picture">
+                      <pic:pic xmlns:pic="http://schemas.openxmlformats.org/drawingml/2006/picture">
+                        <pic:nvPicPr>
+                          <pic:cNvPr id="1380825861" name=""/>
+                          <pic:cNvPicPr/>
+                        </pic:nvPicPr>
+                        <pic:blipFill>
+                          <a:blip r:embed="rId22"/>
+                          <a:stretch>
+                            <a:fillRect/>
+                          </a:stretch>
+                        </pic:blipFill>
+                        <pic:spPr>
+                          <a:xfrm>
+                            <a:off x="0" y="0"/>
+                            <a:ext cx="5696745" cy="543001"/>
+                          </a:xfrm>
+                          <a:prstGeom prst="rect">
+                            <a:avLst/>
+                          </a:prstGeom>
+                        </pic:spPr>
+                      </pic:pic>
+                    </a:graphicData>
+                  </a:graphic>
+                </wp:inline>
+              </w:drawing>
+            </w:r>
+          </w:p>
+        </w:tc>
+      </w:tr>
+      <w:tr>
+        <w:trPr>
+          <w:trHeight w:val="315"/>
+        </w:trPr>
+        <w:tc>
+          <w:tcPr>
+            <w:tcW w:w="532" w:type="dxa"/>
+            <w:tcBorders>
+              <w:top w:val="single" w:sz="6" w:space="0" w:color="CCCCCC"/>
+              <w:left w:val="single" w:sz="6" w:space="0" w:color="CCCCCC"/>
+              <w:bottom w:val="single" w:sz="6" w:space="0" w:color="CCCCCC"/>
+              <w:right w:val="single" w:sz="6" w:space="0" w:color="CCCCCC"/>
+            </w:tcBorders>
+            <w:tcMar>
+              <w:top w:w="0" w:type="dxa"/>
+              <w:left w:w="45" w:type="dxa"/>
+              <w:bottom w:w="0" w:type="dxa"/>
+              <w:right w:w="45" w:type="dxa"/>
+            </w:tcMar>
+            <w:vAlign w:val="bottom"/>
+            <w:hideMark/>
+          </w:tcPr>
+          <w:p>
+            <w:pPr>
+              <w:rPr>
+                <w:rFonts w:ascii="Times New Roman" w:hAnsi="Times New Roman" w:cs="Times New Roman"/>
+              </w:rPr>
+            </w:pPr>
+            <w:r>
+              <w:rPr>
+                <w:rFonts w:ascii="Times New Roman" w:hAnsi="Times New Roman" w:cs="Times New Roman"/>
+              </w:rPr>
+              <w:t>17</w:t>
+            </w:r>
+          </w:p>
+        </w:tc>
+        <w:tc>
+          <w:tcPr>
+            <w:tcW w:w="9360" w:type="dxa"/>
+            <w:tcBorders>
+              <w:top w:val="single" w:sz="6" w:space="0" w:color="CCCCCC"/>
+              <w:left w:val="single" w:sz="6" w:space="0" w:color="CCCCCC"/>
+              <w:bottom w:val="single" w:sz="6" w:space="0" w:color="CCCCCC"/>
+              <w:right w:val="single" w:sz="6" w:space="0" w:color="CCCCCC"/>
+            </w:tcBorders>
+            <w:tcMar>
+              <w:top w:w="0" w:type="dxa"/>
+              <w:left w:w="45" w:type="dxa"/>
+              <w:bottom w:w="0" w:type="dxa"/>
+              <w:right w:w="45" w:type="dxa"/>
+            </w:tcMar>
+            <w:vAlign w:val="bottom"/>
+            <w:hideMark/>
+          </w:tcPr>
+          <w:p>
+            <w:pPr>
+              <w:rPr>
+                <w:rFonts w:ascii="Times New Roman" w:hAnsi="Times New Roman" w:cs="Times New Roman"/>
+              </w:rPr>
+            </w:pPr>
+            <w:r>
+              <w:rPr>
+                <w:rFonts w:ascii="Times New Roman" w:hAnsi="Times New Roman" w:cs="Times New Roman"/>
+              </w:rPr>
+              <w:t>docker inspect &lt;container_id&gt;</w:t>
+            </w:r>
+          </w:p>
+          <w:p>
+            <w:pPr>
+              <w:rPr>
+                <w:rFonts w:ascii="Times New Roman" w:hAnsi="Times New Roman" w:cs="Times New Roman"/>
+              </w:rPr>
+            </w:pPr>
+            <w:r>
+              <w:rPr>
+                <w:rFonts w:ascii="Times New Roman" w:hAnsi="Times New Roman" w:cs="Times New Roman"/>
+              </w:rPr>
+              <w:drawing>
+                <wp:inline distT="0" distB="0" distL="0" distR="0" wp14:anchorId="55DDF6B8" wp14:editId="3F4EDD7D">
+                  <wp:extent cx="5943600" cy="1689735"/>
+                  <wp:effectExtent l="0" t="0" r="0" b="5715"/>
+                  <wp:docPr id="188861985" name="Picture 1"/>
+                  <wp:cNvGraphicFramePr>
+                    <a:graphicFrameLocks xmlns:a="http://schemas.openxmlformats.org/drawingml/2006/main" noChangeAspect="1"/>
+                  </wp:cNvGraphicFramePr>
+                  <a:graphic xmlns:a="http://schemas.openxmlformats.org/drawingml/2006/main">
+                    <a:graphicData uri="http://schemas.openxmlformats.org/drawingml/2006/picture">
+                      <pic:pic xmlns:pic="http://schemas.openxmlformats.org/drawingml/2006/picture">
+                        <pic:nvPicPr>
+                          <pic:cNvPr id="188861985" name=""/>
+                          <pic:cNvPicPr/>
+                        </pic:nvPicPr>
+                        <pic:blipFill>
+                          <a:blip r:embed="rId23"/>
+                          <a:stretch>
+                            <a:fillRect/>
+                          </a:stretch>
+                        </pic:blipFill>
+                        <pic:spPr>
+                          <a:xfrm>
+                            <a:off x="0" y="0"/>
+                            <a:ext cx="5943600" cy="1689735"/>
+                          </a:xfrm>
+                          <a:prstGeom prst="rect">
+                            <a:avLst/>
+                          </a:prstGeom>
+                        </pic:spPr>
+                      </pic:pic>
+                    </a:graphicData>
+                  </a:graphic>
+                </wp:inline>
+              </w:drawing>
+            </w:r>
+          </w:p>
+        </w:tc>
+      </w:tr>
+      <w:tr>
+        <w:trPr>
+          <w:trHeight w:val="315"/>
+        </w:trPr>
+        <w:tc>
+          <w:tcPr>
+            <w:tcW w:w="532" w:type="dxa"/>
+            <w:tcBorders>
+              <w:top w:val="single" w:sz="6" w:space="0" w:color="CCCCCC"/>
+              <w:left w:val="single" w:sz="6" w:space="0" w:color="CCCCCC"/>
+              <w:bottom w:val="single" w:sz="6" w:space="0" w:color="CCCCCC"/>
+              <w:right w:val="single" w:sz="6" w:space="0" w:color="CCCCCC"/>
+            </w:tcBorders>
+            <w:tcMar>
+              <w:top w:w="0" w:type="dxa"/>
+              <w:left w:w="45" w:type="dxa"/>
+              <w:bottom w:w="0" w:type="dxa"/>
+              <w:right w:w="45" w:type="dxa"/>
+            </w:tcMar>
+            <w:vAlign w:val="bottom"/>
+            <w:hideMark/>
+          </w:tcPr>
+          <w:p>
+            <w:pPr>
+              <w:rPr>
+                <w:rFonts w:ascii="Times New Roman" w:hAnsi="Times New Roman" w:cs="Times New Roman"/>
+              </w:rPr>
+            </w:pPr>
+            <w:r>
+              <w:rPr>
+                <w:rFonts w:ascii="Times New Roman" w:hAnsi="Times New Roman" w:cs="Times New Roman"/>
+              </w:rPr>
+              <w:t>18</w:t>
+            </w:r>
+          </w:p>
+        </w:tc>
+        <w:tc>
+          <w:tcPr>
+            <w:tcW w:w="9360" w:type="dxa"/>
+            <w:tcBorders>
+              <w:top w:val="single" w:sz="6" w:space="0" w:color="CCCCCC"/>
+              <w:left w:val="single" w:sz="6" w:space="0" w:color="CCCCCC"/>
+              <w:bottom w:val="single" w:sz="6" w:space="0" w:color="CCCCCC"/>
+              <w:right w:val="single" w:sz="6" w:space="0" w:color="CCCCCC"/>
+            </w:tcBorders>
+            <w:tcMar>
+              <w:top w:w="0" w:type="dxa"/>
+              <w:left w:w="45" w:type="dxa"/>
+              <w:bottom w:w="0" w:type="dxa"/>
+              <w:right w:w="45" w:type="dxa"/>
+            </w:tcMar>
+            <w:vAlign w:val="bottom"/>
+            <w:hideMark/>
+          </w:tcPr>
+          <w:p>
+            <w:pPr>
+              <w:rPr>
+                <w:rFonts w:ascii="Times New Roman" w:hAnsi="Times New Roman" w:cs="Times New Roman"/>
+              </w:rPr>
+            </w:pPr>
+            <w:r>
+              <w:rPr>
+                <w:rFonts w:ascii="Times New Roman" w:hAnsi="Times New Roman" w:cs="Times New Roman"/>
+              </w:rPr>
+              <w:t>docker run -d -v mydata:/data nginx</w:t>
+            </w:r>
+          </w:p>
+          <w:p>
+            <w:pPr>
+              <w:rPr>
+                <w:rFonts w:ascii="Times New Roman" w:hAnsi="Times New Roman" w:cs="Times New Roman"/>
+              </w:rPr>
+            </w:pPr>
+            <w:r>
+              <w:rPr>
+                <w:rFonts w:ascii="Times New Roman" w:hAnsi="Times New Roman" w:cs="Times New Roman"/>
+              </w:rPr>
+              <w:drawing>
+                <wp:inline distT="0" distB="0" distL="0" distR="0" wp14:anchorId="53A2BD7E" wp14:editId="254C7E3D">
+                  <wp:extent cx="5943600" cy="487680"/>
+                  <wp:effectExtent l="0" t="0" r="0" b="7620"/>
+                  <wp:docPr id="1370934992" name="Picture 1"/>
+                  <wp:cNvGraphicFramePr>
+                    <a:graphicFrameLocks xmlns:a="http://schemas.openxmlformats.org/drawingml/2006/main" noChangeAspect="1"/>
+                  </wp:cNvGraphicFramePr>
+                  <a:graphic xmlns:a="http://schemas.openxmlformats.org/drawingml/2006/main">
+                    <a:graphicData uri="http://schemas.openxmlformats.org/drawingml/2006/picture">
+                      <pic:pic xmlns:pic="http://schemas.openxmlformats.org/drawingml/2006/picture">
+                        <pic:nvPicPr>
+                          <pic:cNvPr id="1370934992" name=""/>
+                          <pic:cNvPicPr/>
+                        </pic:nvPicPr>
+                        <pic:blipFill>
+                          <a:blip r:embed="rId24"/>
+                          <a:stretch>
+                            <a:fillRect/>
+                          </a:stretch>
+                        </pic:blipFill>
+                        <pic:spPr>
+                          <a:xfrm>
+                            <a:off x="0" y="0"/>
+                            <a:ext cx="5943600" cy="487680"/>
+                          </a:xfrm>
+                          <a:prstGeom prst="rect">
+                            <a:avLst/>
+                          </a:prstGeom>
+                        </pic:spPr>
+                      </pic:pic>
+                    </a:graphicData>
+                  </a:graphic>
+                </wp:inline>
+              </w:drawing>
+            </w:r>
+          </w:p>
+        </w:tc>
+      </w:tr>
+      <w:tr>
+        <w:trPr>
+          <w:trHeight w:val="315"/>
+        </w:trPr>
+        <w:tc>
+          <w:tcPr>
+            <w:tcW w:w="532" w:type="dxa"/>
+            <w:tcBorders>
+              <w:top w:val="single" w:sz="6" w:space="0" w:color="CCCCCC"/>
+              <w:left w:val="single" w:sz="6" w:space="0" w:color="CCCCCC"/>
+              <w:bottom w:val="single" w:sz="6" w:space="0" w:color="CCCCCC"/>
+              <w:right w:val="single" w:sz="6" w:space="0" w:color="CCCCCC"/>
+            </w:tcBorders>
+            <w:tcMar>
+              <w:top w:w="0" w:type="dxa"/>
+              <w:left w:w="45" w:type="dxa"/>
+              <w:bottom w:w="0" w:type="dxa"/>
+              <w:right w:w="45" w:type="dxa"/>
+            </w:tcMar>
+            <w:vAlign w:val="bottom"/>
+            <w:hideMark/>
+          </w:tcPr>
+          <w:p>
+            <w:pPr>
+              <w:rPr>
+                <w:rFonts w:ascii="Times New Roman" w:hAnsi="Times New Roman" w:cs="Times New Roman"/>
+              </w:rPr>
+            </w:pPr>
+            <w:r>
+              <w:rPr>
+                <w:rFonts w:ascii="Times New Roman" w:hAnsi="Times New Roman" w:cs="Times New Roman"/>
+              </w:rPr>
+              <w:t>19</w:t>
+            </w:r>
+          </w:p>
+        </w:tc>
+        <w:tc>
+          <w:tcPr>
+            <w:tcW w:w="9360" w:type="dxa"/>
+            <w:tcBorders>
+              <w:top w:val="single" w:sz="6" w:space="0" w:color="CCCCCC"/>
+              <w:left w:val="single" w:sz="6" w:space="0" w:color="CCCCCC"/>
+              <w:bottom w:val="single" w:sz="6" w:space="0" w:color="CCCCCC"/>
+              <w:right w:val="single" w:sz="6" w:space="0" w:color="CCCCCC"/>
+            </w:tcBorders>
+            <w:tcMar>
+              <w:top w:w="0" w:type="dxa"/>
+              <w:left w:w="45" w:type="dxa"/>
+              <w:bottom w:w="0" w:type="dxa"/>
+              <w:right w:w="45" w:type="dxa"/>
+            </w:tcMar>
+            <w:vAlign w:val="bottom"/>
+            <w:hideMark/>
+          </w:tcPr>
+          <w:p>
+            <w:pPr>
+              <w:rPr>
+                <w:rFonts w:ascii="Times New Roman" w:hAnsi="Times New Roman" w:cs="Times New Roman"/>
+              </w:rPr>
+            </w:pPr>
+            <w:r>
+              <w:rPr>
+                <w:rFonts w:ascii="Times New Roman" w:hAnsi="Times New Roman" w:cs="Times New Roman"/>
+              </w:rPr>
+              <w:t>docker volume ls</w:t>
+            </w:r>
+          </w:p>
+          <w:p>
+            <w:pPr>
+              <w:rPr>
+                <w:rFonts w:ascii="Times New Roman" w:hAnsi="Times New Roman" w:cs="Times New Roman"/>
+              </w:rPr>
+            </w:pPr>
+            <w:r>
+              <w:rPr>
+                <w:rFonts w:ascii="Times New Roman" w:hAnsi="Times New Roman" w:cs="Times New Roman"/>
+              </w:rPr>
+              <w:drawing>
+                <wp:inline distT="0" distB="0" distL="0" distR="0" wp14:anchorId="25CE2405" wp14:editId="7048A017">
+                  <wp:extent cx="5943600" cy="501650"/>
+                  <wp:effectExtent l="0" t="0" r="0" b="0"/>
+                  <wp:docPr id="1144655807" name="Picture 1"/>
+                  <wp:cNvGraphicFramePr>
+                    <a:graphicFrameLocks xmlns:a="http://schemas.openxmlformats.org/drawingml/2006/main" noChangeAspect="1"/>
+                  </wp:cNvGraphicFramePr>
+                  <a:graphic xmlns:a="http://schemas.openxmlformats.org/drawingml/2006/main">
+                    <a:graphicData uri="http://schemas.openxmlformats.org/drawingml/2006/picture">
+                      <pic:pic xmlns:pic="http://schemas.openxmlformats.org/drawingml/2006/picture">
+                        <pic:nvPicPr>
+                          <pic:cNvPr id="1144655807" name=""/>
+                          <pic:cNvPicPr/>
+                        </pic:nvPicPr>
+                        <pic:blipFill>
+                          <a:blip r:embed="rId25"/>
+                          <a:stretch>
+                            <a:fillRect/>
+                          </a:stretch>
+                        </pic:blipFill>
+                        <pic:spPr>
+                          <a:xfrm>
+                            <a:off x="0" y="0"/>
+                            <a:ext cx="5943600" cy="501650"/>
+                          </a:xfrm>
+                          <a:prstGeom prst="rect">
+                            <a:avLst/>
+                          </a:prstGeom>
+                        </pic:spPr>
+                      </pic:pic>
+                    </a:graphicData>
+                  </a:graphic>
+                </wp:inline>
+              </w:drawing>
+            </w:r>
+          </w:p>
+        </w:tc>
+      </w:tr>
+      <w:tr>
+        <w:trPr>
+          <w:trHeight w:val="315"/>
+        </w:trPr>
+        <w:tc>
+          <w:tcPr>
+            <w:tcW w:w="532" w:type="dxa"/>
+            <w:tcBorders>
+              <w:top w:val="single" w:sz="6" w:space="0" w:color="CCCCCC"/>
+              <w:left w:val="single" w:sz="6" w:space="0" w:color="CCCCCC"/>
+              <w:bottom w:val="single" w:sz="6" w:space="0" w:color="CCCCCC"/>
+              <w:right w:val="single" w:sz="6" w:space="0" w:color="CCCCCC"/>
+            </w:tcBorders>
+            <w:tcMar>
+              <w:top w:w="0" w:type="dxa"/>
+              <w:left w:w="45" w:type="dxa"/>
+              <w:bottom w:w="0" w:type="dxa"/>
+              <w:right w:w="45" w:type="dxa"/>
+            </w:tcMar>
+            <w:vAlign w:val="bottom"/>
+            <w:hideMark/>
+          </w:tcPr>
+          <w:p>
+            <w:pPr>
+              <w:rPr>
+                <w:rFonts w:ascii="Times New Roman" w:hAnsi="Times New Roman" w:cs="Times New Roman"/>
+              </w:rPr>
+            </w:pPr>
+            <w:r>
+              <w:rPr>
+                <w:rFonts w:ascii="Times New Roman" w:hAnsi="Times New Roman" w:cs="Times New Roman"/>
+              </w:rPr>
+              <w:lastRenderedPageBreak/>
+              <w:t>20</w:t>
+            </w:r>
+          </w:p>
+        </w:tc>
+        <w:tc>
+          <w:tcPr>
+            <w:tcW w:w="9360" w:type="dxa"/>
+            <w:tcBorders>
+              <w:top w:val="single" w:sz="6" w:space="0" w:color="CCCCCC"/>
+              <w:left w:val="single" w:sz="6" w:space="0" w:color="CCCCCC"/>
+              <w:bottom w:val="single" w:sz="6" w:space="0" w:color="CCCCCC"/>
+              <w:right w:val="single" w:sz="6" w:space="0" w:color="CCCCCC"/>
+            </w:tcBorders>
+            <w:tcMar>
+              <w:top w:w="0" w:type="dxa"/>
+              <w:left w:w="45" w:type="dxa"/>
+              <w:bottom w:w="0" w:type="dxa"/>
+              <w:right w:w="45" w:type="dxa"/>
+            </w:tcMar>
+            <w:vAlign w:val="bottom"/>
+            <w:hideMark/>
+          </w:tcPr>
+          <w:p>
+            <w:pPr>
+              <w:rPr>
+                <w:rFonts w:ascii="Times New Roman" w:hAnsi="Times New Roman" w:cs="Times New Roman"/>
+              </w:rPr>
+            </w:pPr>
+            <w:r>
+              <w:rPr>
+                <w:rFonts w:ascii="Times New Roman" w:hAnsi="Times New Roman" w:cs="Times New Roman"/>
+              </w:rPr>
+              <w:t>docker volume prune</w:t>
+            </w:r>
+          </w:p>
+          <w:p>
+            <w:pPr>
+              <w:rPr>
+                <w:rFonts w:ascii="Times New Roman" w:hAnsi="Times New Roman" w:cs="Times New Roman"/>
+              </w:rPr>
+            </w:pPr>
+            <w:r>
+              <w:rPr>
+                <w:rFonts w:ascii="Times New Roman" w:hAnsi="Times New Roman" w:cs="Times New Roman"/>
+              </w:rPr>
+              <w:drawing>
+                <wp:inline distT="0" distB="0" distL="0" distR="0" wp14:anchorId="391DB2D6" wp14:editId="4362985B">
+                  <wp:extent cx="5943600" cy="504190"/>
+                  <wp:effectExtent l="0" t="0" r="0" b="0"/>
+                  <wp:docPr id="39568731" name="Picture 1"/>
+                  <wp:cNvGraphicFramePr>
+                    <a:graphicFrameLocks xmlns:a="http://schemas.openxmlformats.org/drawingml/2006/main" noChangeAspect="1"/>
+                  </wp:cNvGraphicFramePr>
+                  <a:graphic xmlns:a="http://schemas.openxmlformats.org/drawingml/2006/main">
+                    <a:graphicData uri="http://schemas.openxmlformats.org/drawingml/2006/picture">
+                      <pic:pic xmlns:pic="http://schemas.openxmlformats.org/drawingml/2006/picture">
+                        <pic:nvPicPr>
+                          <pic:cNvPr id="39568731" name=""/>
+                          <pic:cNvPicPr/>
+                        </pic:nvPicPr>
+                        <pic:blipFill>
+                          <a:blip r:embed="rId26"/>
+                          <a:stretch>
+                            <a:fillRect/>
+                          </a:stretch>
+                        </pic:blipFill>
+                        <pic:spPr>
+                          <a:xfrm>
+                            <a:off x="0" y="0"/>
+                            <a:ext cx="5943600" cy="504190"/>
+                          </a:xfrm>
+                          <a:prstGeom prst="rect">
+                            <a:avLst/>
+                          </a:prstGeom>
+                        </pic:spPr>
+                      </pic:pic>
+                    </a:graphicData>
+                  </a:graphic>
+                </wp:inline>
+              </w:drawing>
+            </w:r>
+          </w:p>
+        </w:tc>
+      </w:tr>
+      <w:tr>
+        <w:trPr>
+          <w:trHeight w:val="315"/>
+        </w:trPr>
+        <w:tc>
+          <w:tcPr>
+            <w:tcW w:w="532" w:type="dxa"/>
+            <w:tcBorders>
+              <w:top w:val="single" w:sz="6" w:space="0" w:color="CCCCCC"/>
+              <w:left w:val="single" w:sz="6" w:space="0" w:color="CCCCCC"/>
+              <w:bottom w:val="single" w:sz="6" w:space="0" w:color="CCCCCC"/>
+              <w:right w:val="single" w:sz="6" w:space="0" w:color="CCCCCC"/>
+            </w:tcBorders>
+            <w:tcMar>
+              <w:top w:w="0" w:type="dxa"/>
+              <w:left w:w="45" w:type="dxa"/>
+              <w:bottom w:w="0" w:type="dxa"/>
+              <w:right w:w="45" w:type="dxa"/>
+            </w:tcMar>
+            <w:vAlign w:val="bottom"/>
+            <w:hideMark/>
+          </w:tcPr>
+          <w:p>
+            <w:pPr>
+              <w:rPr>
+                <w:rFonts w:ascii="Times New Roman" w:hAnsi="Times New Roman" w:cs="Times New Roman"/>
+              </w:rPr>
+            </w:pPr>
+            <w:r>
+              <w:rPr>
+                <w:rFonts w:ascii="Times New Roman" w:hAnsi="Times New Roman" w:cs="Times New Roman"/>
+              </w:rPr>
+              <w:t>21</w:t>
+            </w:r>
+          </w:p>
+        </w:tc>
+        <w:tc>
+          <w:tcPr>
+            <w:tcW w:w="9360" w:type="dxa"/>
+            <w:tcBorders>
+              <w:top w:val="single" w:sz="6" w:space="0" w:color="CCCCCC"/>
+              <w:left w:val="single" w:sz="6" w:space="0" w:color="CCCCCC"/>
+              <w:bottom w:val="single" w:sz="6" w:space="0" w:color="CCCCCC"/>
+              <w:right w:val="single" w:sz="6" w:space="0" w:color="CCCCCC"/>
+            </w:tcBorders>
+            <w:tcMar>
+              <w:top w:w="0" w:type="dxa"/>
+              <w:left w:w="45" w:type="dxa"/>
+              <w:bottom w:w="0" w:type="dxa"/>
+              <w:right w:w="45" w:type="dxa"/>
+            </w:tcMar>
+            <w:vAlign w:val="bottom"/>
+            <w:hideMark/>
+          </w:tcPr>
+          <w:p>
+            <w:pPr>
+              <w:rPr>
+                <w:rFonts w:ascii="Times New Roman" w:hAnsi="Times New Roman" w:cs="Times New Roman"/>
+              </w:rPr>
+            </w:pPr>
+            <w:r>
+              <w:rPr>
+                <w:rFonts w:ascii="Times New Roman" w:hAnsi="Times New Roman" w:cs="Times New Roman"/>
+              </w:rPr>
+              <w:t>docker run -d --name my_nginx nginx</w:t>
+            </w:r>
+          </w:p>
+          <w:p>
+            <w:pPr>
+              <w:rPr>
+                <w:rFonts w:ascii="Times New Roman" w:hAnsi="Times New Roman" w:cs="Times New Roman"/>
+              </w:rPr>
+            </w:pPr>
+            <w:r>
+              <w:rPr>
+                <w:rFonts w:ascii="Times New Roman" w:hAnsi="Times New Roman" w:cs="Times New Roman"/>
+              </w:rPr>
+              <w:drawing>
+                <wp:inline distT="0" distB="0" distL="0" distR="0" wp14:anchorId="3FEA2065" wp14:editId="13E9A620">
+                  <wp:extent cx="5782482" cy="514422"/>
+                  <wp:effectExtent l="0" t="0" r="0" b="0"/>
+                  <wp:docPr id="362558253" name="Picture 1"/>
+                  <wp:cNvGraphicFramePr>
+                    <a:graphicFrameLocks xmlns:a="http://schemas.openxmlformats.org/drawingml/2006/main" noChangeAspect="1"/>
+                  </wp:cNvGraphicFramePr>
+                  <a:graphic xmlns:a="http://schemas.openxmlformats.org/drawingml/2006/main">
+                    <a:graphicData uri="http://schemas.openxmlformats.org/drawingml/2006/picture">
+                      <pic:pic xmlns:pic="http://schemas.openxmlformats.org/drawingml/2006/picture">
+                        <pic:nvPicPr>
+                          <pic:cNvPr id="362558253" name=""/>
+                          <pic:cNvPicPr/>
+                        </pic:nvPicPr>
+                        <pic:blipFill>
+                          <a:blip r:embed="rId27"/>
+                          <a:stretch>
+                            <a:fillRect/>
+                          </a:stretch>
+                        </pic:blipFill>
+                        <pic:spPr>
+                          <a:xfrm>
+                            <a:off x="0" y="0"/>
+                            <a:ext cx="5782482" cy="514422"/>
+                          </a:xfrm>
+                          <a:prstGeom prst="rect">
+                            <a:avLst/>
+                          </a:prstGeom>
+                        </pic:spPr>
+                      </pic:pic>
+                    </a:graphicData>
+                  </a:graphic>
+                </wp:inline>
+              </w:drawing>
+            </w:r>
+          </w:p>
+        </w:tc>
+      </w:tr>
+      <w:tr>
+        <w:trPr>
+          <w:trHeight w:val="315"/>
+        </w:trPr>
+        <w:tc>
+          <w:tcPr>
+            <w:tcW w:w="532" w:type="dxa"/>
+            <w:tcBorders>
+              <w:top w:val="single" w:sz="6" w:space="0" w:color="CCCCCC"/>
+              <w:left w:val="single" w:sz="6" w:space="0" w:color="CCCCCC"/>
+              <w:bottom w:val="single" w:sz="6" w:space="0" w:color="CCCCCC"/>
+              <w:right w:val="single" w:sz="6" w:space="0" w:color="CCCCCC"/>
+            </w:tcBorders>
+            <w:tcMar>
+              <w:top w:w="0" w:type="dxa"/>
+              <w:left w:w="45" w:type="dxa"/>
+              <w:bottom w:w="0" w:type="dxa"/>
+              <w:right w:w="45" w:type="dxa"/>
+            </w:tcMar>
+            <w:vAlign w:val="bottom"/>
+            <w:hideMark/>
+          </w:tcPr>
+          <w:p>
+            <w:pPr>
+              <w:rPr>
+                <w:rFonts w:ascii="Times New Roman" w:hAnsi="Times New Roman" w:cs="Times New Roman"/>
+              </w:rPr>
+            </w:pPr>
+            <w:r>
+              <w:rPr>
+                <w:rFonts w:ascii="Times New Roman" w:hAnsi="Times New Roman" w:cs="Times New Roman"/>
+              </w:rPr>
+              <w:t>22</w:t>
+            </w:r>
+          </w:p>
+        </w:tc>
+        <w:tc>
+          <w:tcPr>
+            <w:tcW w:w="9360" w:type="dxa"/>
+            <w:tcBorders>
+              <w:top w:val="single" w:sz="6" w:space="0" w:color="CCCCCC"/>
+              <w:left w:val="single" w:sz="6" w:space="0" w:color="CCCCCC"/>
+              <w:bottom w:val="single" w:sz="6" w:space="0" w:color="CCCCCC"/>
+              <w:right w:val="single" w:sz="6" w:space="0" w:color="CCCCCC"/>
+            </w:tcBorders>
+            <w:tcMar>
+              <w:top w:w="0" w:type="dxa"/>
+              <w:left w:w="45" w:type="dxa"/>
+              <w:bottom w:w="0" w:type="dxa"/>
+              <w:right w:w="45" w:type="dxa"/>
+            </w:tcMar>
+            <w:vAlign w:val="bottom"/>
+            <w:hideMark/>
+          </w:tcPr>
+          <w:p>
+            <w:pPr>
+              <w:rPr>
+                <w:rFonts w:ascii="Times New Roman" w:hAnsi="Times New Roman" w:cs="Times New Roman"/>
+              </w:rPr>
+            </w:pPr>
+            <w:r>
+              <w:rPr>
+                <w:rFonts w:ascii="Times New Roman" w:hAnsi="Times New Roman" w:cs="Times New Roman"/>
+              </w:rPr>
+              <w:t>docker stats</w:t>
+            </w:r>
+          </w:p>
+          <w:p>
+            <w:pPr>
+              <w:rPr>
+                <w:rFonts w:ascii="Times New Roman" w:hAnsi="Times New Roman" w:cs="Times New Roman"/>
+              </w:rPr>
+            </w:pPr>
+            <w:r>
+              <w:rPr>
+                <w:rFonts w:ascii="Times New Roman" w:hAnsi="Times New Roman" w:cs="Times New Roman"/>
+              </w:rPr>
+              <w:drawing>
+                <wp:inline distT="0" distB="0" distL="0" distR="0" wp14:anchorId="3799D20B" wp14:editId="231BCA70">
+                  <wp:extent cx="5943600" cy="485775"/>
+                  <wp:effectExtent l="0" t="0" r="0" b="9525"/>
+                  <wp:docPr id="1593139439" name="Picture 1"/>
+                  <wp:cNvGraphicFramePr>
+                    <a:graphicFrameLocks xmlns:a="http://schemas.openxmlformats.org/drawingml/2006/main" noChangeAspect="1"/>
+                  </wp:cNvGraphicFramePr>
+                  <a:graphic xmlns:a="http://schemas.openxmlformats.org/drawingml/2006/main">
+                    <a:graphicData uri="http://schemas.openxmlformats.org/drawingml/2006/picture">
+                      <pic:pic xmlns:pic="http://schemas.openxmlformats.org/drawingml/2006/picture">
+                        <pic:nvPicPr>
+                          <pic:cNvPr id="1593139439" name=""/>
+                          <pic:cNvPicPr/>
+                        </pic:nvPicPr>
+                        <pic:blipFill>
+                          <a:blip r:embed="rId28"/>
+                          <a:stretch>
+                            <a:fillRect/>
+                          </a:stretch>
+                        </pic:blipFill>
+                        <pic:spPr>
+                          <a:xfrm>
+                            <a:off x="0" y="0"/>
+                            <a:ext cx="5943600" cy="485775"/>
+                          </a:xfrm>
+                          <a:prstGeom prst="rect">
+                            <a:avLst/>
+                          </a:prstGeom>
+                        </pic:spPr>
+                      </pic:pic>
+                    </a:graphicData>
+                  </a:graphic>
+                </wp:inline>
+              </w:drawing>
+            </w:r>
+          </w:p>
+        </w:tc>
+      </w:tr>
+      <w:tr>
+        <w:trPr>
+          <w:trHeight w:val="315"/>
+        </w:trPr>
+        <w:tc>
+          <w:tcPr>
+            <w:tcW w:w="532" w:type="dxa"/>
+            <w:tcBorders>
+              <w:top w:val="single" w:sz="6" w:space="0" w:color="CCCCCC"/>
+              <w:left w:val="single" w:sz="6" w:space="0" w:color="CCCCCC"/>
+              <w:bottom w:val="single" w:sz="6" w:space="0" w:color="CCCCCC"/>
+              <w:right w:val="single" w:sz="6" w:space="0" w:color="CCCCCC"/>
+            </w:tcBorders>
+            <w:tcMar>
+              <w:top w:w="0" w:type="dxa"/>
+              <w:left w:w="45" w:type="dxa"/>
+              <w:bottom w:w="0" w:type="dxa"/>
+              <w:right w:w="45" w:type="dxa"/>
+            </w:tcMar>
+            <w:vAlign w:val="bottom"/>
+            <w:hideMark/>
+          </w:tcPr>
+          <w:p>
+            <w:pPr>
+              <w:rPr>
+                <w:rFonts w:ascii="Times New Roman" w:hAnsi="Times New Roman" w:cs="Times New Roman"/>
+              </w:rPr>
+            </w:pPr>
+            <w:r>
+              <w:rPr>
+                <w:rFonts w:ascii="Times New Roman" w:hAnsi="Times New Roman" w:cs="Times New Roman"/>
+              </w:rPr>
+              <w:t>23</w:t>
+            </w:r>
+          </w:p>
+        </w:tc>
+        <w:tc>
+          <w:tcPr>
+            <w:tcW w:w="9360" w:type="dxa"/>
+            <w:tcBorders>
+              <w:top w:val="single" w:sz="6" w:space="0" w:color="CCCCCC"/>
+              <w:left w:val="single" w:sz="6" w:space="0" w:color="CCCCCC"/>
+              <w:bottom w:val="single" w:sz="6" w:space="0" w:color="CCCCCC"/>
+              <w:right w:val="single" w:sz="6" w:space="0" w:color="CCCCCC"/>
+            </w:tcBorders>
+            <w:tcMar>
+              <w:top w:w="0" w:type="dxa"/>
+              <w:left w:w="45" w:type="dxa"/>
+              <w:bottom w:w="0" w:type="dxa"/>
+              <w:right w:w="45" w:type="dxa"/>
+            </w:tcMar>
+            <w:vAlign w:val="bottom"/>
+            <w:hideMark/>
+          </w:tcPr>
+          <w:p>
+            <w:pPr>
+              <w:rPr>
+                <w:rFonts w:ascii="Times New Roman" w:hAnsi="Times New Roman" w:cs="Times New Roman"/>
+              </w:rPr>
+            </w:pPr>
+            <w:r>
+              <w:rPr>
+                <w:rFonts w:ascii="Times New Roman" w:hAnsi="Times New Roman" w:cs="Times New Roman"/>
+              </w:rPr>
+              <w:t>docker network ls</w:t>
+            </w:r>
+          </w:p>
+          <w:p>
+            <w:pPr>
+              <w:rPr>
+                <w:rFonts w:ascii="Times New Roman" w:hAnsi="Times New Roman" w:cs="Times New Roman"/>
+              </w:rPr>
+            </w:pPr>
+            <w:r>
+              <w:rPr>
+                <w:rFonts w:ascii="Times New Roman" w:hAnsi="Times New Roman" w:cs="Times New Roman"/>
+              </w:rPr>
+              <w:drawing>
+                <wp:inline distT="0" distB="0" distL="0" distR="0" wp14:anchorId="107FF0A3" wp14:editId="173F490D">
+                  <wp:extent cx="5943600" cy="1163955"/>
+                  <wp:effectExtent l="0" t="0" r="0" b="0"/>
+                  <wp:docPr id="405955450" name="Picture 1"/>
+                  <wp:cNvGraphicFramePr>
+                    <a:graphicFrameLocks xmlns:a="http://schemas.openxmlformats.org/drawingml/2006/main" noChangeAspect="1"/>
+                  </wp:cNvGraphicFramePr>
+                  <a:graphic xmlns:a="http://schemas.openxmlformats.org/drawingml/2006/main">
+                    <a:graphicData uri="http://schemas.openxmlformats.org/drawingml/2006/picture">
+                      <pic:pic xmlns:pic="http://schemas.openxmlformats.org/drawingml/2006/picture">
+                        <pic:nvPicPr>
+                          <pic:cNvPr id="405955450" name=""/>
+                          <pic:cNvPicPr/>
+                        </pic:nvPicPr>
+                        <pic:blipFill>
+                          <a:blip r:embed="rId29"/>
+                          <a:stretch>
+                            <a:fillRect/>
+                          </a:stretch>
+                        </pic:blipFill>
+                        <pic:spPr>
+                          <a:xfrm>
+                            <a:off x="0" y="0"/>
+                            <a:ext cx="5943600" cy="1163955"/>
+                          </a:xfrm>
+                          <a:prstGeom prst="rect">
+                            <a:avLst/>
+                          </a:prstGeom>
+                        </pic:spPr>
+                      </pic:pic>
+                    </a:graphicData>
+                  </a:graphic>
+                </wp:inline>
+              </w:drawing>
+            </w:r>
+          </w:p>
+        </w:tc>
+      </w:tr>
+      <w:tr>
+        <w:trPr>
+          <w:trHeight w:val="315"/>
+        </w:trPr>
+        <w:tc>
+          <w:tcPr>
+            <w:tcW w:w="532" w:type="dxa"/>
+            <w:tcBorders>
+              <w:top w:val="single" w:sz="6" w:space="0" w:color="CCCCCC"/>
+              <w:left w:val="single" w:sz="6" w:space="0" w:color="CCCCCC"/>
+              <w:bottom w:val="single" w:sz="6" w:space="0" w:color="CCCCCC"/>
+              <w:right w:val="single" w:sz="6" w:space="0" w:color="CCCCCC"/>
+            </w:tcBorders>
+            <w:tcMar>
+              <w:top w:w="0" w:type="dxa"/>
+              <w:left w:w="45" w:type="dxa"/>
+              <w:bottom w:w="0" w:type="dxa"/>
+              <w:right w:w="45" w:type="dxa"/>
+            </w:tcMar>
+            <w:vAlign w:val="bottom"/>
+            <w:hideMark/>
+          </w:tcPr>
+          <w:p>
+            <w:pPr>
+              <w:rPr>
+                <w:rFonts w:ascii="Times New Roman" w:hAnsi="Times New Roman" w:cs="Times New Roman"/>
+              </w:rPr>
+            </w:pPr>
+            <w:r>
+              <w:rPr>
+                <w:rFonts w:ascii="Times New Roman" w:hAnsi="Times New Roman" w:cs="Times New Roman"/>
+              </w:rPr>
+              <w:t>24</w:t>
+            </w:r>
+          </w:p>
+        </w:tc>
+        <w:tc>
+          <w:tcPr>
+            <w:tcW w:w="9360" w:type="dxa"/>
+            <w:tcBorders>
+              <w:top w:val="single" w:sz="6" w:space="0" w:color="CCCCCC"/>
+              <w:left w:val="single" w:sz="6" w:space="0" w:color="CCCCCC"/>
+              <w:bottom w:val="single" w:sz="6" w:space="0" w:color="CCCCCC"/>
+              <w:right w:val="single" w:sz="6" w:space="0" w:color="CCCCCC"/>
+            </w:tcBorders>
+            <w:tcMar>
+              <w:top w:w="0" w:type="dxa"/>
+              <w:left w:w="45" w:type="dxa"/>
+              <w:bottom w:w="0" w:type="dxa"/>
+              <w:right w:w="45" w:type="dxa"/>
+            </w:tcMar>
+            <w:vAlign w:val="bottom"/>
+            <w:hideMark/>
+          </w:tcPr>
+          <w:p>
+            <w:pPr>
+              <w:rPr>
+                <w:rFonts w:ascii="Times New Roman" w:hAnsi="Times New Roman" w:cs="Times New Roman"/>
+              </w:rPr>
+            </w:pPr>
+            <w:r>
+              <w:rPr>
+                <w:rFonts w:ascii="Times New Roman" w:hAnsi="Times New Roman" w:cs="Times New Roman"/>
+              </w:rPr>
+              <w:t>docker network create my_network</w:t>
+            </w:r>
+          </w:p>
+          <w:p>
+            <w:pPr>
+              <w:rPr>
+                <w:rFonts w:ascii="Times New Roman" w:hAnsi="Times New Roman" w:cs="Times New Roman"/>
+              </w:rPr>
+            </w:pPr>
+            <w:r>
+              <w:rPr>
+                <w:rFonts w:ascii="Times New Roman" w:hAnsi="Times New Roman" w:cs="Times New Roman"/>
+              </w:rPr>
+              <w:drawing>
+                <wp:inline distT="0" distB="0" distL="0" distR="0" wp14:anchorId="1C95E9FC" wp14:editId="3E3E23AA">
+                  <wp:extent cx="5896798" cy="466790"/>
+                  <wp:effectExtent l="0" t="0" r="8890" b="9525"/>
+                  <wp:docPr id="1740268831" name="Picture 1"/>
+                  <wp:cNvGraphicFramePr>
+                    <a:graphicFrameLocks xmlns:a="http://schemas.openxmlformats.org/drawingml/2006/main" noChangeAspect="1"/>
+                  </wp:cNvGraphicFramePr>
+                  <a:graphic xmlns:a="http://schemas.openxmlformats.org/drawingml/2006/main">
+                    <a:graphicData uri="http://schemas.openxmlformats.org/drawingml/2006/picture">
+                      <pic:pic xmlns:pic="http://schemas.openxmlformats.org/drawingml/2006/picture">
+                        <pic:nvPicPr>
+                          <pic:cNvPr id="1740268831" name=""/>
+                          <pic:cNvPicPr/>
+                        </pic:nvPicPr>
+                        <pic:blipFill>
+                          <a:blip r:embed="rId30"/>
+                          <a:stretch>
+                            <a:fillRect/>
+                          </a:stretch>
+                        </pic:blipFill>
+                        <pic:spPr>
+                          <a:xfrm>
+                            <a:off x="0" y="0"/>
+                            <a:ext cx="5896798" cy="466790"/>
+                          </a:xfrm>
+                          <a:prstGeom prst="rect">
+                            <a:avLst/>
+                          </a:prstGeom>
+                        </pic:spPr>
+                      </pic:pic>
+                    </a:graphicData>
+                  </a:graphic>
+                </wp:inline>
+              </w:drawing>
+            </w:r>
+          </w:p>
+        </w:tc>
+      </w:tr>
+      <w:tr>
+        <w:trPr>
+          <w:trHeight w:val="315"/>
+        </w:trPr>
+        <w:tc>
+          <w:tcPr>
+            <w:tcW w:w="532" w:type="dxa"/>
+            <w:tcBorders>
+              <w:top w:val="single" w:sz="6" w:space="0" w:color="CCCCCC"/>
+              <w:left w:val="single" w:sz="6" w:space="0" w:color="CCCCCC"/>
+              <w:bottom w:val="single" w:sz="6" w:space="0" w:color="CCCCCC"/>
+              <w:right w:val="single" w:sz="6" w:space="0" w:color="CCCCCC"/>
+            </w:tcBorders>
+            <w:tcMar>
+              <w:top w:w="0" w:type="dxa"/>
+              <w:left w:w="45" w:type="dxa"/>
+              <w:bottom w:w="0" w:type="dxa"/>
+              <w:right w:w="45" w:type="dxa"/>
+            </w:tcMar>
+            <w:vAlign w:val="bottom"/>
+            <w:hideMark/>
+          </w:tcPr>
+          <w:p>
+            <w:pPr>
+              <w:rPr>
+                <w:rFonts w:ascii="Times New Roman" w:hAnsi="Times New Roman" w:cs="Times New Roman"/>
+              </w:rPr>
+            </w:pPr>
+            <w:r>
+              <w:rPr>
+                <w:rFonts w:ascii="Times New Roman" w:hAnsi="Times New Roman" w:cs="Times New Roman"/>
+              </w:rPr>
+              <w:t>25</w:t>
+            </w:r>
+          </w:p>
+        </w:tc>
+        <w:tc>
+          <w:tcPr>
+            <w:tcW w:w="9360" w:type="dxa"/>
+            <w:tcBorders>
+              <w:top w:val="single" w:sz="6" w:space="0" w:color="CCCCCC"/>
+              <w:left w:val="single" w:sz="6" w:space="0" w:color="CCCCCC"/>
+              <w:bottom w:val="single" w:sz="6" w:space="0" w:color="CCCCCC"/>
+              <w:right w:val="single" w:sz="6" w:space="0" w:color="CCCCCC"/>
+            </w:tcBorders>
+            <w:tcMar>
+              <w:top w:w="0" w:type="dxa"/>
+              <w:left w:w="45" w:type="dxa"/>
+              <w:bottom w:w="0" w:type="dxa"/>
+              <w:right w:w="45" w:type="dxa"/>
+            </w:tcMar>
+            <w:vAlign w:val="bottom"/>
+            <w:hideMark/>
+          </w:tcPr>
+          <w:p>
+            <w:pPr>
+              <w:rPr>
+                <w:rFonts w:ascii="Times New Roman" w:hAnsi="Times New Roman" w:cs="Times New Roman"/>
+              </w:rPr>
+            </w:pPr>
+            <w:r>
+              <w:rPr>
+                <w:rFonts w:ascii="Times New Roman" w:hAnsi="Times New Roman" w:cs="Times New Roman"/>
+              </w:rPr>
+              <w:t>docker run -d --network my_network --name my_container nginx</w:t>
+            </w:r>
+          </w:p>
+          <w:p>
+            <w:pPr>
+              <w:rPr>
+                <w:rFonts w:ascii="Times New Roman" w:hAnsi="Times New Roman" w:cs="Times New Roman"/>
+              </w:rPr>
+            </w:pPr>
+            <w:r>
+              <w:rPr>
+                <w:rFonts w:ascii="Times New Roman" w:hAnsi="Times New Roman" w:cs="Times New Roman"/>
+              </w:rPr>
+              <w:drawing>
+                <wp:inline distT="0" distB="0" distL="0" distR="0" wp14:anchorId="77DFCC68" wp14:editId="5FB19D74">
+                  <wp:extent cx="5943600" cy="372745"/>
+                  <wp:effectExtent l="0" t="0" r="0" b="8255"/>
+                  <wp:docPr id="1179777731" name="Picture 1"/>
+                  <wp:cNvGraphicFramePr>
+                    <a:graphicFrameLocks xmlns:a="http://schemas.openxmlformats.org/drawingml/2006/main" noChangeAspect="1"/>
+                  </wp:cNvGraphicFramePr>
+                  <a:graphic xmlns:a="http://schemas.openxmlformats.org/drawingml/2006/main">
+                    <a:graphicData uri="http://schemas.openxmlformats.org/drawingml/2006/picture">
+                      <pic:pic xmlns:pic="http://schemas.openxmlformats.org/drawingml/2006/picture">
+                        <pic:nvPicPr>
+                          <pic:cNvPr id="1179777731" name=""/>
+                          <pic:cNvPicPr/>
+                        </pic:nvPicPr>
+                        <pic:blipFill>
+                          <a:blip r:embed="rId31"/>
+                          <a:stretch>
+                            <a:fillRect/>
+                          </a:stretch>
+                        </pic:blipFill>
+                        <pic:spPr>
+                          <a:xfrm>
+                            <a:off x="0" y="0"/>
+                            <a:ext cx="5943600" cy="372745"/>
+                          </a:xfrm>
+                          <a:prstGeom prst="rect">
+                            <a:avLst/>
+                          </a:prstGeom>
+                        </pic:spPr>
+                      </pic:pic>
+                    </a:graphicData>
+                  </a:graphic>
+                </wp:inline>
+              </w:drawing>
+            </w:r>
+          </w:p>
+        </w:tc>
+      </w:tr>
+      <w:tr>
+        <w:trPr>
+          <w:trHeight w:val="315"/>
+        </w:trPr>
+        <w:tc>
+          <w:tcPr>
+            <w:tcW w:w="532" w:type="dxa"/>
+            <w:tcBorders>
+              <w:top w:val="single" w:sz="6" w:space="0" w:color="CCCCCC"/>
+              <w:left w:val="single" w:sz="6" w:space="0" w:color="CCCCCC"/>
+              <w:bottom w:val="single" w:sz="6" w:space="0" w:color="CCCCCC"/>
+              <w:right w:val="single" w:sz="6" w:space="0" w:color="CCCCCC"/>
+            </w:tcBorders>
+            <w:tcMar>
+              <w:top w:w="0" w:type="dxa"/>
+              <w:left w:w="45" w:type="dxa"/>
+              <w:bottom w:w="0" w:type="dxa"/>
+              <w:right w:w="45" w:type="dxa"/>
+            </w:tcMar>
+            <w:vAlign w:val="bottom"/>
+            <w:hideMark/>
+          </w:tcPr>
+          <w:p>
+            <w:pPr>
+              <w:rPr>
+                <w:rFonts w:ascii="Times New Roman" w:hAnsi="Times New Roman" w:cs="Times New Roman"/>
+              </w:rPr>
+            </w:pPr>
+            <w:r>
+              <w:rPr>
+                <w:rFonts w:ascii="Times New Roman" w:hAnsi="Times New Roman" w:cs="Times New Roman"/>
+              </w:rPr>
+              <w:t>26</w:t>
+            </w:r>
+          </w:p>
+        </w:tc>
+        <w:tc>
+          <w:tcPr>
+            <w:tcW w:w="9360" w:type="dxa"/>
+            <w:tcBorders>
+              <w:top w:val="single" w:sz="6" w:space="0" w:color="CCCCCC"/>
+              <w:left w:val="single" w:sz="6" w:space="0" w:color="CCCCCC"/>
+              <w:bottom w:val="single" w:sz="6" w:space="0" w:color="CCCCCC"/>
+              <w:right w:val="single" w:sz="6" w:space="0" w:color="CCCCCC"/>
+            </w:tcBorders>
+            <w:tcMar>
+              <w:top w:w="0" w:type="dxa"/>
+              <w:left w:w="45" w:type="dxa"/>
+              <w:bottom w:w="0" w:type="dxa"/>
+              <w:right w:w="45" w:type="dxa"/>
+            </w:tcMar>
+            <w:vAlign w:val="bottom"/>
+            <w:hideMark/>
+          </w:tcPr>
+          <w:p>
+            <w:pPr>
+              <w:rPr>
+                <w:rFonts w:ascii="Times New Roman" w:hAnsi="Times New Roman" w:cs="Times New Roman"/>
+              </w:rPr>
+            </w:pPr>
+            <w:r>
+              <w:rPr>
+                <w:rFonts w:ascii="Times New Roman" w:hAnsi="Times New Roman" w:cs="Times New Roman"/>
+              </w:rPr>
+              <w:t>docker network connect my_network my_nginx</w:t>
+            </w:r>
+          </w:p>
+          <w:p>
+            <w:pPr>
+              <w:rPr>
+                <w:rFonts w:ascii="Times New Roman" w:hAnsi="Times New Roman" w:cs="Times New Roman"/>
+              </w:rPr>
+            </w:pPr>
+            <w:r>
+              <w:rPr>
+                <w:rFonts w:ascii="Times New Roman" w:hAnsi="Times New Roman" w:cs="Times New Roman"/>
+              </w:rPr>
+              <w:drawing>
+                <wp:inline distT="0" distB="0" distL="0" distR="0" wp14:anchorId="45DB6C20" wp14:editId="0DCFE5AA">
+                  <wp:extent cx="5943600" cy="280035"/>
+                  <wp:effectExtent l="0" t="0" r="0" b="5715"/>
+                  <wp:docPr id="1690583325" name="Picture 1"/>
+                  <wp:cNvGraphicFramePr>
+                    <a:graphicFrameLocks xmlns:a="http://schemas.openxmlformats.org/drawingml/2006/main" noChangeAspect="1"/>
+                  </wp:cNvGraphicFramePr>
+                  <a:graphic xmlns:a="http://schemas.openxmlformats.org/drawingml/2006/main">
+                    <a:graphicData uri="http://schemas.openxmlformats.org/drawingml/2006/picture">
+                      <pic:pic xmlns:pic="http://schemas.openxmlformats.org/drawingml/2006/picture">
+                        <pic:nvPicPr>
+                          <pic:cNvPr id="1690583325" name=""/>
+                          <pic:cNvPicPr/>
+                        </pic:nvPicPr>
+                        <pic:blipFill>
+                          <a:blip r:embed="rId32"/>
+                          <a:stretch>
+                            <a:fillRect/>
+                          </a:stretch>
+                        </pic:blipFill>
+                        <pic:spPr>
+                          <a:xfrm>
+                            <a:off x="0" y="0"/>
+                            <a:ext cx="5943600" cy="280035"/>
+                          </a:xfrm>
+                          <a:prstGeom prst="rect">
+                            <a:avLst/>
+                          </a:prstGeom>
+                        </pic:spPr>
+                      </pic:pic>
+                    </a:graphicData>
+                  </a:graphic>
+                </wp:inline>
+              </w:drawing>
+            </w:r>
+          </w:p>
+        </w:tc>
+      </w:tr>
+      <w:tr>
+        <w:trPr>
+          <w:trHeight w:val="315"/>
+        </w:trPr>
+        <w:tc>
+          <w:tcPr>
+            <w:tcW w:w="532" w:type="dxa"/>
+            <w:tcBorders>
+              <w:top w:val="single" w:sz="6" w:space="0" w:color="CCCCCC"/>
+              <w:left w:val="single" w:sz="6" w:space="0" w:color="CCCCCC"/>
+              <w:bottom w:val="single" w:sz="6" w:space="0" w:color="CCCCCC"/>
+              <w:right w:val="single" w:sz="6" w:space="0" w:color="CCCCCC"/>
+            </w:tcBorders>
+            <w:tcMar>
+              <w:top w:w="0" w:type="dxa"/>
+              <w:left w:w="45" w:type="dxa"/>
+              <w:bottom w:w="0" w:type="dxa"/>
+              <w:right w:w="45" w:type="dxa"/>
+            </w:tcMar>
+            <w:vAlign w:val="bottom"/>
+            <w:hideMark/>
+          </w:tcPr>
+          <w:p>
+            <w:pPr>
+              <w:rPr>
+                <w:rFonts w:ascii="Times New Roman" w:hAnsi="Times New Roman" w:cs="Times New Roman"/>
+              </w:rPr>
+            </w:pPr>
+            <w:r>
+              <w:rPr>
+                <w:rFonts w:ascii="Times New Roman" w:hAnsi="Times New Roman" w:cs="Times New Roman"/>
+              </w:rPr>
+              <w:t>27</w:t>
+            </w:r>
+          </w:p>
+        </w:tc>
+        <w:tc>
+          <w:tcPr>
+            <w:tcW w:w="9360" w:type="dxa"/>
+            <w:tcBorders>
+              <w:top w:val="single" w:sz="6" w:space="0" w:color="CCCCCC"/>
+              <w:left w:val="single" w:sz="6" w:space="0" w:color="CCCCCC"/>
+              <w:bottom w:val="single" w:sz="6" w:space="0" w:color="CCCCCC"/>
+              <w:right w:val="single" w:sz="6" w:space="0" w:color="CCCCCC"/>
+            </w:tcBorders>
+            <w:tcMar>
+              <w:top w:w="0" w:type="dxa"/>
+              <w:left w:w="45" w:type="dxa"/>
+              <w:bottom w:w="0" w:type="dxa"/>
+              <w:right w:w="45" w:type="dxa"/>
+            </w:tcMar>
+            <w:vAlign w:val="bottom"/>
+            <w:hideMark/>
+          </w:tcPr>
+          <w:p>
+            <w:pPr>
+              <w:rPr>
+                <w:rFonts w:ascii="Times New Roman" w:hAnsi="Times New Roman" w:cs="Times New Roman"/>
+              </w:rPr>
+            </w:pPr>
+            <w:r>
+              <w:rPr>
+                <w:rFonts w:ascii="Times New Roman" w:hAnsi="Times New Roman" w:cs="Times New Roman"/>
+              </w:rPr>
+              <w:t>docker run -d -e MY_ENV=hello_world nginx</w:t>
+            </w:r>
+          </w:p>
+          <w:p>
+            <w:pPr>
+              <w:rPr>
+                <w:rFonts w:ascii="Times New Roman" w:hAnsi="Times New Roman" w:cs="Times New Roman"/>
+              </w:rPr>
+            </w:pPr>
+            <w:r>
+              <w:rPr>
+                <w:rFonts w:ascii="Times New Roman" w:hAnsi="Times New Roman" w:cs="Times New Roman"/>
+              </w:rPr>
+              <w:drawing>
+                <wp:inline distT="0" distB="0" distL="0" distR="0" wp14:anchorId="6F3660CC" wp14:editId="142C7370">
+                  <wp:extent cx="5943600" cy="413385"/>
+                  <wp:effectExtent l="0" t="0" r="0" b="5715"/>
+                  <wp:docPr id="1107593229" name="Picture 1"/>
+                  <wp:cNvGraphicFramePr>
+                    <a:graphicFrameLocks xmlns:a="http://schemas.openxmlformats.org/drawingml/2006/main" noChangeAspect="1"/>
+                  </wp:cNvGraphicFramePr>
+                  <a:graphic xmlns:a="http://schemas.openxmlformats.org/drawingml/2006/main">
+                    <a:graphicData uri="http://schemas.openxmlformats.org/drawingml/2006/picture">
+                      <pic:pic xmlns:pic="http://schemas.openxmlformats.org/drawingml/2006/picture">
+                        <pic:nvPicPr>
+                          <pic:cNvPr id="1107593229" name=""/>
+                          <pic:cNvPicPr/>
+                        </pic:nvPicPr>
+                        <pic:blipFill>
+                          <a:blip r:embed="rId33"/>
+                          <a:stretch>
+                            <a:fillRect/>
+                          </a:stretch>
+                        </pic:blipFill>
+                        <pic:spPr>
+                          <a:xfrm>
+                            <a:off x="0" y="0"/>
+                            <a:ext cx="5943600" cy="413385"/>
+                          </a:xfrm>
+                          <a:prstGeom prst="rect">
+                            <a:avLst/>
+                          </a:prstGeom>
+                        </pic:spPr>
+                      </pic:pic>
+                    </a:graphicData>
+                  </a:graphic>
+                </wp:inline>
+              </w:drawing>
+            </w:r>
+          </w:p>
+          <w:p>
+            <w:pPr>
+              <w:rPr>
+                <w:rFonts w:ascii="Times New Roman" w:hAnsi="Times New Roman" w:cs="Times New Roman"/>
+              </w:rPr>
+            </w:pPr>
+          </w:p>
+        </w:tc>
+      </w:tr>
+      <w:tr>
+        <w:trPr>
+          <w:trHeight w:val="315"/>
+        </w:trPr>
+        <w:tc>
+          <w:tcPr>
+            <w:tcW w:w="532" w:type="dxa"/>
+            <w:tcBorders>
+              <w:top w:val="single" w:sz="6" w:space="0" w:color="CCCCCC"/>
+              <w:left w:val="single" w:sz="6" w:space="0" w:color="CCCCCC"/>
+              <w:bottom w:val="single" w:sz="6" w:space="0" w:color="CCCCCC"/>
+              <w:right w:val="single" w:sz="6" w:space="0" w:color="CCCCCC"/>
+            </w:tcBorders>
+            <w:tcMar>
+              <w:top w:w="0" w:type="dxa"/>
+              <w:left w:w="45" w:type="dxa"/>
+              <w:bottom w:w="0" w:type="dxa"/>
+              <w:right w:w="45" w:type="dxa"/>
+            </w:tcMar>
+            <w:vAlign w:val="bottom"/>
+            <w:hideMark/>
+          </w:tcPr>
+          <w:p>
+            <w:pPr>
+              <w:rPr>
+                <w:rFonts w:ascii="Times New Roman" w:hAnsi="Times New Roman" w:cs="Times New Roman"/>
+              </w:rPr>
+            </w:pPr>
+            <w:r>
+              <w:rPr>
+                <w:rFonts w:ascii="Times New Roman" w:hAnsi="Times New Roman" w:cs="Times New Roman"/>
+              </w:rPr>
+              <w:lastRenderedPageBreak/>
+              <w:t>28</w:t>
+            </w:r>
+          </w:p>
+        </w:tc>
+        <w:tc>
+          <w:tcPr>
+            <w:tcW w:w="9360" w:type="dxa"/>
+            <w:tcBorders>
+              <w:top w:val="single" w:sz="6" w:space="0" w:color="CCCCCC"/>
+              <w:left w:val="single" w:sz="6" w:space="0" w:color="CCCCCC"/>
+              <w:bottom w:val="single" w:sz="6" w:space="0" w:color="CCCCCC"/>
+              <w:right w:val="single" w:sz="6" w:space="0" w:color="CCCCCC"/>
+            </w:tcBorders>
+            <w:tcMar>
+              <w:top w:w="0" w:type="dxa"/>
+              <w:left w:w="45" w:type="dxa"/>
+              <w:bottom w:w="0" w:type="dxa"/>
+              <w:right w:w="45" w:type="dxa"/>
+            </w:tcMar>
+            <w:vAlign w:val="bottom"/>
+            <w:hideMark/>
+          </w:tcPr>
+          <w:p>
+            <w:pPr>
+              <w:rPr>
+                <w:rFonts w:ascii="Times New Roman" w:hAnsi="Times New Roman" w:cs="Times New Roman"/>
+              </w:rPr>
+            </w:pPr>
+            <w:r>
+              <w:rPr>
+                <w:rFonts w:ascii="Times New Roman" w:hAnsi="Times New Roman" w:cs="Times New Roman"/>
+              </w:rPr>
+              <w:t>docker logs -f my_nginx</w:t>
+            </w:r>
+          </w:p>
+          <w:p>
+            <w:pPr>
+              <w:rPr>
+                <w:rFonts w:ascii="Times New Roman" w:hAnsi="Times New Roman" w:cs="Times New Roman"/>
+              </w:rPr>
+            </w:pPr>
+            <w:r>
+              <w:rPr>
+                <w:rFonts w:ascii="Times New Roman" w:hAnsi="Times New Roman" w:cs="Times New Roman"/>
+              </w:rPr>
+              <w:drawing>
+                <wp:inline distT="0" distB="0" distL="0" distR="0" wp14:anchorId="771978F3" wp14:editId="27420434">
+                  <wp:extent cx="5943600" cy="3091815"/>
+                  <wp:effectExtent l="0" t="0" r="0" b="0"/>
+                  <wp:docPr id="469920904" name="Picture 1"/>
+                  <wp:cNvGraphicFramePr>
+                    <a:graphicFrameLocks xmlns:a="http://schemas.openxmlformats.org/drawingml/2006/main" noChangeAspect="1"/>
+                  </wp:cNvGraphicFramePr>
+                  <a:graphic xmlns:a="http://schemas.openxmlformats.org/drawingml/2006/main">
+                    <a:graphicData uri="http://schemas.openxmlformats.org/drawingml/2006/picture">
+                      <pic:pic xmlns:pic="http://schemas.openxmlformats.org/drawingml/2006/picture">
+                        <pic:nvPicPr>
+                          <pic:cNvPr id="469920904" name=""/>
+                          <pic:cNvPicPr/>
+                        </pic:nvPicPr>
+                        <pic:blipFill>
+                          <a:blip r:embed="rId34"/>
+                          <a:stretch>
+                            <a:fillRect/>
+                          </a:stretch>
+                        </pic:blipFill>
+                        <pic:spPr>
+                          <a:xfrm>
+                            <a:off x="0" y="0"/>
+                            <a:ext cx="5943600" cy="3091815"/>
+                          </a:xfrm>
+                          <a:prstGeom prst="rect">
+                            <a:avLst/>
+                          </a:prstGeom>
+                        </pic:spPr>
+                      </pic:pic>
+                    </a:graphicData>
+                  </a:graphic>
+                </wp:inline>
+              </w:drawing>
+            </w:r>
+          </w:p>
+        </w:tc>
+      </w:tr>
+      <w:tr>
+        <w:trPr>
+          <w:trHeight w:val="315"/>
+        </w:trPr>
+        <w:tc>
+          <w:tcPr>
+            <w:tcW w:w="532" w:type="dxa"/>
+            <w:vMerge w:val="restart"/>
+            <w:tcBorders>
+              <w:top w:val="single" w:sz="6" w:space="0" w:color="CCCCCC"/>
+              <w:left w:val="single" w:sz="6" w:space="0" w:color="CCCCCC"/>
+              <w:bottom w:val="single" w:sz="6" w:space="0" w:color="CCCCCC"/>
+              <w:right w:val="single" w:sz="6" w:space="0" w:color="CCCCCC"/>
+            </w:tcBorders>
+            <w:tcMar>
+              <w:top w:w="0" w:type="dxa"/>
+              <w:left w:w="45" w:type="dxa"/>
+              <w:bottom w:w="0" w:type="dxa"/>
+              <w:right w:w="45" w:type="dxa"/>
+            </w:tcMar>
+            <w:vAlign w:val="center"/>
+            <w:hideMark/>
+          </w:tcPr>
+          <w:p>
+            <w:pPr>
+              <w:rPr>
+                <w:rFonts w:ascii="Times New Roman" w:hAnsi="Times New Roman" w:cs="Times New Roman"/>
+              </w:rPr>
+            </w:pPr>
+            <w:r>
+              <w:rPr>
+                <w:rFonts w:ascii="Times New Roman" w:hAnsi="Times New Roman" w:cs="Times New Roman"/>
+              </w:rPr>
+              <w:t>29</w:t>
+            </w:r>
+          </w:p>
+        </w:tc>
+        <w:tc>
+          <w:tcPr>
+            <w:tcW w:w="9360" w:type="dxa"/>
+            <w:tcBorders>
+              <w:top w:val="single" w:sz="6" w:space="0" w:color="CCCCCC"/>
+              <w:left w:val="single" w:sz="6" w:space="0" w:color="CCCCCC"/>
+              <w:bottom w:val="single" w:sz="6" w:space="0" w:color="CCCCCC"/>
+              <w:right w:val="single" w:sz="6" w:space="0" w:color="CCCCCC"/>
+            </w:tcBorders>
+            <w:tcMar>
+              <w:top w:w="0" w:type="dxa"/>
+              <w:left w:w="45" w:type="dxa"/>
+              <w:bottom w:w="0" w:type="dxa"/>
+              <w:right w:w="45" w:type="dxa"/>
+            </w:tcMar>
+            <w:vAlign w:val="bottom"/>
+            <w:hideMark/>
+          </w:tcPr>
+          <w:p>
+            <w:pPr>
+              <w:rPr>
+                <w:rFonts w:ascii="Times New Roman" w:hAnsi="Times New Roman" w:cs="Times New Roman"/>
+              </w:rPr>
+            </w:pPr>
+            <w:r>
+              <w:rPr>
+                <w:rFonts w:ascii="Times New Roman" w:hAnsi="Times New Roman" w:cs="Times New Roman"/>
+              </w:rPr>
+              <w:t>FROM nginx</w:t>
+            </w:r>
+          </w:p>
+        </w:tc>
+      </w:tr>
+      <w:tr>
+        <w:trPr>
+          <w:trHeight w:val="315"/>
+        </w:trPr>
+        <w:tc>
+          <w:tcPr>
+            <w:tcW w:w="532" w:type="dxa"/>
+            <w:vMerge/>
+            <w:tcBorders>
+              <w:top w:val="single" w:sz="6" w:space="0" w:color="CCCCCC"/>
+              <w:left w:val="single" w:sz="6" w:space="0" w:color="CCCCCC"/>
+              <w:bottom w:val="single" w:sz="6" w:space="0" w:color="CCCCCC"/>
+              <w:right w:val="single" w:sz="6" w:space="0" w:color="CCCCCC"/>
+            </w:tcBorders>
+            <w:vAlign w:val="center"/>
+            <w:hideMark/>
+          </w:tcPr>
+          <w:p>
+            <w:pPr>
+              <w:rPr>
+                <w:rFonts w:ascii="Times New Roman" w:hAnsi="Times New Roman" w:cs="Times New Roman"/>
+              </w:rPr>
+            </w:pPr>
+          </w:p>
+        </w:tc>
+        <w:tc>
+          <w:tcPr>
+            <w:tcW w:w="9360" w:type="dxa"/>
+            <w:tcBorders>
+              <w:top w:val="single" w:sz="6" w:space="0" w:color="CCCCCC"/>
+              <w:left w:val="single" w:sz="6" w:space="0" w:color="CCCCCC"/>
+              <w:bottom w:val="single" w:sz="6" w:space="0" w:color="CCCCCC"/>
+              <w:right w:val="single" w:sz="6" w:space="0" w:color="CCCCCC"/>
+            </w:tcBorders>
+            <w:tcMar>
+              <w:top w:w="0" w:type="dxa"/>
+              <w:left w:w="45" w:type="dxa"/>
+              <w:bottom w:w="0" w:type="dxa"/>
+              <w:right w:w="45" w:type="dxa"/>
+            </w:tcMar>
+            <w:vAlign w:val="bottom"/>
+            <w:hideMark/>
+          </w:tcPr>
+          <w:p>
+            <w:pPr>
+              <w:rPr>
+                <w:rFonts w:ascii="Times New Roman" w:hAnsi="Times New Roman" w:cs="Times New Roman"/>
+              </w:rPr>
+            </w:pPr>
+            <w:r>
+              <w:rPr>
+                <w:rFonts w:ascii="Times New Roman" w:hAnsi="Times New Roman" w:cs="Times New Roman"/>
+              </w:rPr>
+              <w:t>COPY index.html /usr/share/nginx/html/index.html</w:t>
+            </w:r>
+          </w:p>
+          <w:p>
+            <w:pPr>
+              <w:rPr>
+                <w:rFonts w:ascii="Times New Roman" w:hAnsi="Times New Roman" w:cs="Times New Roman"/>
+              </w:rPr>
+            </w:pPr>
+            <w:r>
+              <w:rPr>
+                <w:rFonts w:ascii="Times New Roman" w:hAnsi="Times New Roman" w:cs="Times New Roman"/>
+              </w:rPr>
+              <w:drawing>
+                <wp:inline distT="0" distB="0" distL="0" distR="0" wp14:anchorId="4A27FEDD" wp14:editId="7B693641">
+                  <wp:extent cx="3372321" cy="857370"/>
+                  <wp:effectExtent l="0" t="0" r="0" b="0"/>
+                  <wp:docPr id="60514362" name="Picture 1"/>
+                  <wp:cNvGraphicFramePr>
+                    <a:graphicFrameLocks xmlns:a="http://schemas.openxmlformats.org/drawingml/2006/main" noChangeAspect="1"/>
+                  </wp:cNvGraphicFramePr>
+                  <a:graphic xmlns:a="http://schemas.openxmlformats.org/drawingml/2006/main">
+                    <a:graphicData uri="http://schemas.openxmlformats.org/drawingml/2006/picture">
+                      <pic:pic xmlns:pic="http://schemas.openxmlformats.org/drawingml/2006/picture">
+                        <pic:nvPicPr>
+                          <pic:cNvPr id="60514362" name=""/>
+                          <pic:cNvPicPr/>
+                        </pic:nvPicPr>
+                        <pic:blipFill>
+                          <a:blip r:embed="rId35"/>
+                          <a:stretch>
+                            <a:fillRect/>
+                          </a:stretch>
+                        </pic:blipFill>
+                        <pic:spPr>
+                          <a:xfrm>
+                            <a:off x="0" y="0"/>
+                            <a:ext cx="3372321" cy="857370"/>
+                          </a:xfrm>
+                          <a:prstGeom prst="rect">
+                            <a:avLst/>
+                          </a:prstGeom>
+                        </pic:spPr>
+                      </pic:pic>
+                    </a:graphicData>
+                  </a:graphic>
+                </wp:inline>
+              </w:drawing>
+            </w:r>
+          </w:p>
+        </w:tc>
+      </w:tr>
+      <w:tr>
+        <w:trPr>
+          <w:trHeight w:val="315"/>
+        </w:trPr>
+        <w:tc>
+          <w:tcPr>
+            <w:tcW w:w="532" w:type="dxa"/>
+            <w:tcBorders>
+              <w:top w:val="single" w:sz="6" w:space="0" w:color="CCCCCC"/>
+              <w:left w:val="single" w:sz="6" w:space="0" w:color="CCCCCC"/>
+              <w:bottom w:val="single" w:sz="6" w:space="0" w:color="CCCCCC"/>
+              <w:right w:val="single" w:sz="6" w:space="0" w:color="CCCCCC"/>
+            </w:tcBorders>
+            <w:tcMar>
+              <w:top w:w="0" w:type="dxa"/>
+              <w:left w:w="45" w:type="dxa"/>
+              <w:bottom w:w="0" w:type="dxa"/>
+              <w:right w:w="45" w:type="dxa"/>
+            </w:tcMar>
+            <w:vAlign w:val="center"/>
+            <w:hideMark/>
+          </w:tcPr>
+          <w:p>
+            <w:pPr>
+              <w:rPr>
+                <w:rFonts w:ascii="Times New Roman" w:hAnsi="Times New Roman" w:cs="Times New Roman"/>
+              </w:rPr>
+            </w:pPr>
+            <w:r>
+              <w:rPr>
+                <w:rFonts w:ascii="Times New Roman" w:hAnsi="Times New Roman" w:cs="Times New Roman"/>
+              </w:rPr>
+              <w:t>30</w:t>
+            </w:r>
+          </w:p>
+        </w:tc>
+        <w:tc>
+          <w:tcPr>
+            <w:tcW w:w="9360" w:type="dxa"/>
+            <w:tcBorders>
+              <w:top w:val="single" w:sz="6" w:space="0" w:color="CCCCCC"/>
+              <w:left w:val="single" w:sz="6" w:space="0" w:color="CCCCCC"/>
+              <w:bottom w:val="single" w:sz="6" w:space="0" w:color="CCCCCC"/>
+              <w:right w:val="single" w:sz="6" w:space="0" w:color="CCCCCC"/>
+            </w:tcBorders>
+            <w:tcMar>
+              <w:top w:w="0" w:type="dxa"/>
+              <w:left w:w="45" w:type="dxa"/>
+              <w:bottom w:w="0" w:type="dxa"/>
+              <w:right w:w="45" w:type="dxa"/>
+            </w:tcMar>
+            <w:vAlign w:val="bottom"/>
+            <w:hideMark/>
+          </w:tcPr>
+          <w:p>
+            <w:pPr>
+              <w:rPr>
+                <w:rFonts w:ascii="Times New Roman" w:hAnsi="Times New Roman" w:cs="Times New Roman"/>
+              </w:rPr>
+            </w:pPr>
+            <w:r>
+              <w:rPr>
+                <w:rFonts w:ascii="Times New Roman" w:hAnsi="Times New Roman" w:cs="Times New Roman"/>
+              </w:rPr>
+              <w:t>docker build -t my_nginx_image .</w:t>
+            </w:r>
+          </w:p>
+          <w:p>
+            <w:pPr>
+              <w:rPr>
+                <w:rFonts w:ascii="Times New Roman" w:hAnsi="Times New Roman" w:cs="Times New Roman"/>
+              </w:rPr>
+            </w:pPr>
+            <w:r>
+              <w:rPr>
+                <w:rFonts w:ascii="Times New Roman" w:hAnsi="Times New Roman" w:cs="Times New Roman"/>
+              </w:rPr>
+              <w:drawing>
+                <wp:inline distT="0" distB="0" distL="0" distR="0" wp14:anchorId="0E3CD58D" wp14:editId="4ED93759">
+                  <wp:extent cx="5943600" cy="1843405"/>
+                  <wp:effectExtent l="0" t="0" r="0" b="4445"/>
+                  <wp:docPr id="1771580752" name="Picture 1"/>
+                  <wp:cNvGraphicFramePr>
+                    <a:graphicFrameLocks xmlns:a="http://schemas.openxmlformats.org/drawingml/2006/main" noChangeAspect="1"/>
+                  </wp:cNvGraphicFramePr>
+                  <a:graphic xmlns:a="http://schemas.openxmlformats.org/drawingml/2006/main">
+                    <a:graphicData uri="http://schemas.openxmlformats.org/drawingml/2006/picture">
+                      <pic:pic xmlns:pic="http://schemas.openxmlformats.org/drawingml/2006/picture">
+                        <pic:nvPicPr>
+                          <pic:cNvPr id="1771580752" name=""/>
+                          <pic:cNvPicPr/>
+                        </pic:nvPicPr>
+                        <pic:blipFill>
+                          <a:blip r:embed="rId36"/>
+                          <a:stretch>
+                            <a:fillRect/>
+                          </a:stretch>
+                        </pic:blipFill>
+                        <pic:spPr>
+                          <a:xfrm>
+                            <a:off x="0" y="0"/>
+                            <a:ext cx="5943600" cy="1843405"/>
+                          </a:xfrm>
+                          <a:prstGeom prst="rect">
+                            <a:avLst/>
+                          </a:prstGeom>
+                        </pic:spPr>
+                      </pic:pic>
+                    </a:graphicData>
+                  </a:graphic>
+                </wp:inline>
+              </w:drawing>
+            </w:r>
+          </w:p>
+        </w:tc>
+      </w:tr>
+      <w:tr>
+        <w:trPr>
+          <w:trHeight w:val="315"/>
+        </w:trPr>
+        <w:tc>
+          <w:tcPr>
+            <w:tcW w:w="532" w:type="dxa"/>
+            <w:tcBorders>
+              <w:top w:val="single" w:sz="6" w:space="0" w:color="CCCCCC"/>
+              <w:left w:val="single" w:sz="6" w:space="0" w:color="CCCCCC"/>
+              <w:bottom w:val="single" w:sz="6" w:space="0" w:color="CCCCCC"/>
+              <w:right w:val="single" w:sz="6" w:space="0" w:color="CCCCCC"/>
+            </w:tcBorders>
+            <w:tcMar>
+              <w:top w:w="0" w:type="dxa"/>
+              <w:left w:w="45" w:type="dxa"/>
+              <w:bottom w:w="0" w:type="dxa"/>
+              <w:right w:w="45" w:type="dxa"/>
+            </w:tcMar>
+            <w:vAlign w:val="bottom"/>
+            <w:hideMark/>
+          </w:tcPr>
+          <w:p>
+            <w:pPr>
+              <w:rPr>
+                <w:rFonts w:ascii="Times New Roman" w:hAnsi="Times New Roman" w:cs="Times New Roman"/>
+              </w:rPr>
+            </w:pPr>
+            <w:r>
+              <w:rPr>
+                <w:rFonts w:ascii="Times New Roman" w:hAnsi="Times New Roman" w:cs="Times New Roman"/>
+              </w:rPr>
+              <w:t>31</w:t>
+            </w:r>
+          </w:p>
+        </w:tc>
+        <w:tc>
+          <w:tcPr>
+            <w:tcW w:w="9360" w:type="dxa"/>
+            <w:tcBorders>
+              <w:top w:val="single" w:sz="6" w:space="0" w:color="CCCCCC"/>
+              <w:left w:val="single" w:sz="6" w:space="0" w:color="CCCCCC"/>
+              <w:bottom w:val="single" w:sz="6" w:space="0" w:color="CCCCCC"/>
+              <w:right w:val="single" w:sz="6" w:space="0" w:color="CCCCCC"/>
+            </w:tcBorders>
+            <w:tcMar>
+              <w:top w:w="0" w:type="dxa"/>
+              <w:left w:w="45" w:type="dxa"/>
+              <w:bottom w:w="0" w:type="dxa"/>
+              <w:right w:w="45" w:type="dxa"/>
+            </w:tcMar>
+            <w:vAlign w:val="bottom"/>
+            <w:hideMark/>
+          </w:tcPr>
+          <w:p>
+            <w:pPr>
+              <w:rPr>
+                <w:rFonts w:ascii="Times New Roman" w:hAnsi="Times New Roman" w:cs="Times New Roman"/>
+              </w:rPr>
+            </w:pPr>
+            <w:r>
+              <w:rPr>
+                <w:rFonts w:ascii="Times New Roman" w:hAnsi="Times New Roman" w:cs="Times New Roman"/>
+              </w:rPr>
+              <w:t>docker run -d -p 8080:80 my_nginx_image</w:t>
+            </w:r>
+          </w:p>
+        </w:tc>
+      </w:tr>
+    </w:tbl>
+    <w:p>
+      <w:pPr>
+        <w:rPr>
+          <w:rFonts w:ascii="Times New Roman" w:hAnsi="Times New Roman" w:cs="Times New Roman"/>
+          <w:b/>
+          <w:bCs/>
+        </w:rPr>
+      </w:pPr>
+      <w:r>
+        <w:rPr>
+          <w:rFonts w:ascii="Times New Roman" w:hAnsi="Times New Roman" w:cs="Times New Roman"/>
+          <w:b/>
+          <w:bCs/>
         </w:rPr>
         <w:br/>
       </w:r>

</xml_diff>